<commit_message>
Fixes bug related to Edit User's Email Fixes bug where orders with discounts are not senting updated totals to Moneris
</commit_message>
<xml_diff>
--- a/CUWebinars.Web/App_Data/mergeTemplates/WeeklyInvoice1.docx
+++ b/CUWebinars.Web/App_Data/mergeTemplates/WeeklyInvoice1.docx
@@ -196,142 +196,6 @@
       <w:r>
         <w:rPr>
           <w:rFonts w:eastAsia="Times New Roman" w:cs="Times New Roman"/>
-          <w:color w:val="auto"/>
-          <w:sz w:val="22"/>
-          <w:szCs w:val="22"/>
-        </w:rPr>
-        <w:t xml:space="preserve">To: </w:t>
-      </w:r>
-      <w:r>
-        <w:rPr>
-          <w:rFonts w:eastAsia="Times New Roman" w:cs="Times New Roman"/>
-          <w:color w:val="auto"/>
-          <w:sz w:val="22"/>
-          <w:szCs w:val="22"/>
-        </w:rPr>
-        <w:fldChar w:fldCharType="begin"/>
-      </w:r>
-      <w:r>
-        <w:rPr>
-          <w:rFonts w:eastAsia="Times New Roman" w:cs="Times New Roman"/>
-          <w:color w:val="auto"/>
-          <w:sz w:val="22"/>
-          <w:szCs w:val="22"/>
-        </w:rPr>
-        <w:instrText xml:space="preserve"> MERGEFIELD  DisplayTitle  \* MERGEFORMAT </w:instrText>
-      </w:r>
-      <w:r>
-        <w:rPr>
-          <w:rFonts w:eastAsia="Times New Roman" w:cs="Times New Roman"/>
-          <w:color w:val="auto"/>
-          <w:sz w:val="22"/>
-          <w:szCs w:val="22"/>
-        </w:rPr>
-        <w:fldChar w:fldCharType="separate"/>
-      </w:r>
-      <w:r>
-        <w:rPr>
-          <w:rFonts w:eastAsia="Times New Roman" w:cs="Times New Roman"/>
-          <w:noProof/>
-          <w:color w:val="auto"/>
-          <w:sz w:val="22"/>
-          <w:szCs w:val="22"/>
-        </w:rPr>
-        <w:t>«DisplayTitle»</w:t>
-      </w:r>
-      <w:r>
-        <w:rPr>
-          <w:rFonts w:eastAsia="Times New Roman" w:cs="Times New Roman"/>
-          <w:color w:val="auto"/>
-          <w:sz w:val="22"/>
-          <w:szCs w:val="22"/>
-        </w:rPr>
-        <w:fldChar w:fldCharType="end"/>
-      </w:r>
-      <w:r>
-        <w:rPr>
-          <w:rFonts w:eastAsia="Times New Roman" w:cs="Times New Roman"/>
-          <w:color w:val="auto"/>
-          <w:sz w:val="22"/>
-          <w:szCs w:val="22"/>
-        </w:rPr>
-        <w:t xml:space="preserve"> - </w:t>
-      </w:r>
-      <w:r>
-        <w:rPr>
-          <w:rFonts w:eastAsia="Times New Roman" w:cs="Times New Roman"/>
-          <w:color w:val="auto"/>
-          <w:sz w:val="22"/>
-          <w:szCs w:val="22"/>
-        </w:rPr>
-        <w:fldChar w:fldCharType="begin"/>
-      </w:r>
-      <w:r>
-        <w:rPr>
-          <w:rFonts w:eastAsia="Times New Roman" w:cs="Times New Roman"/>
-          <w:color w:val="auto"/>
-          <w:sz w:val="22"/>
-          <w:szCs w:val="22"/>
-        </w:rPr>
-        <w:instrText xml:space="preserve"> MERGEFIELD  RoyaltyTier  \* MERGEFORMAT </w:instrText>
-      </w:r>
-      <w:r>
-        <w:rPr>
-          <w:rFonts w:eastAsia="Times New Roman" w:cs="Times New Roman"/>
-          <w:color w:val="auto"/>
-          <w:sz w:val="22"/>
-          <w:szCs w:val="22"/>
-        </w:rPr>
-        <w:fldChar w:fldCharType="separate"/>
-      </w:r>
-      <w:r>
-        <w:rPr>
-          <w:rFonts w:eastAsia="Times New Roman" w:cs="Times New Roman"/>
-          <w:noProof/>
-          <w:color w:val="auto"/>
-          <w:sz w:val="22"/>
-          <w:szCs w:val="22"/>
-        </w:rPr>
-        <w:t>«RoyaltyTier»</w:t>
-      </w:r>
-      <w:r>
-        <w:rPr>
-          <w:rFonts w:eastAsia="Times New Roman" w:cs="Times New Roman"/>
-          <w:color w:val="auto"/>
-          <w:sz w:val="22"/>
-          <w:szCs w:val="22"/>
-        </w:rPr>
-        <w:fldChar w:fldCharType="end"/>
-      </w:r>
-      <w:r>
-        <w:rPr>
-          <w:rFonts w:eastAsia="Times New Roman" w:cs="Times New Roman"/>
-          <w:color w:val="auto"/>
-          <w:sz w:val="22"/>
-          <w:szCs w:val="22"/>
-        </w:rPr>
-        <w:br/>
-        <w:t>Summary:</w:t>
-      </w:r>
-    </w:p>
-    <w:p>
-      <w:pPr>
-        <w:tabs>
-          <w:tab w:val="right" w:pos="3330"/>
-        </w:tabs>
-        <w:spacing w:before="0" w:after="200" w:line="276" w:lineRule="auto"/>
-        <w:ind w:right="0" w:firstLine="576"/>
-        <w:contextualSpacing/>
-        <w:rPr>
-          <w:rFonts w:eastAsia="Times New Roman" w:cs="Times New Roman"/>
-          <w:color w:val="auto"/>
-          <w:sz w:val="22"/>
-          <w:szCs w:val="22"/>
-        </w:rPr>
-      </w:pPr>
-      <w:r>
-        <w:rPr>
-          <w:rFonts w:eastAsia="Times New Roman" w:cs="Times New Roman"/>
           <w:noProof/>
           <w:color w:val="auto"/>
           <w:sz w:val="22"/>
@@ -340,16 +204,16 @@
         <mc:AlternateContent>
           <mc:Choice Requires="wps">
             <w:drawing>
-              <wp:anchor distT="45720" distB="45720" distL="114300" distR="114300" simplePos="0" relativeHeight="251659264" behindDoc="0" locked="0" layoutInCell="1" allowOverlap="1">
+              <wp:anchor distT="45720" distB="45720" distL="114300" distR="114300" simplePos="0" relativeHeight="251659264" behindDoc="0" locked="0" layoutInCell="1" allowOverlap="1" wp14:anchorId="4A20D2F3" wp14:editId="684989C5">
                 <wp:simplePos x="0" y="0"/>
                 <wp:positionH relativeFrom="margin">
-                  <wp:align>right</wp:align>
+                  <wp:posOffset>4589194</wp:posOffset>
                 </wp:positionH>
                 <wp:positionV relativeFrom="paragraph">
-                  <wp:posOffset>6546</wp:posOffset>
+                  <wp:posOffset>161144</wp:posOffset>
                 </wp:positionV>
-                <wp:extent cx="2360930" cy="1404620"/>
-                <wp:effectExtent l="0" t="0" r="0" b="7620"/>
+                <wp:extent cx="4582795" cy="1404620"/>
+                <wp:effectExtent l="0" t="0" r="8255" b="7620"/>
                 <wp:wrapSquare wrapText="bothSides"/>
                 <wp:docPr id="217" name="Text Box 2"/>
                 <wp:cNvGraphicFramePr>
@@ -364,7 +228,7 @@
                       <wps:spPr bwMode="auto">
                         <a:xfrm>
                           <a:off x="0" y="0"/>
-                          <a:ext cx="2360930" cy="1404620"/>
+                          <a:ext cx="4582795" cy="1404620"/>
                         </a:xfrm>
                         <a:prstGeom prst="rect">
                           <a:avLst/>
@@ -441,21 +305,21 @@
                   </a:graphicData>
                 </a:graphic>
                 <wp14:sizeRelH relativeFrom="margin">
-                  <wp14:pctWidth>40000</wp14:pctWidth>
+                  <wp14:pctWidth>0</wp14:pctWidth>
                 </wp14:sizeRelH>
                 <wp14:sizeRelV relativeFrom="margin">
-                  <wp14:pctHeight>20000</wp14:pctHeight>
+                  <wp14:pctHeight>0</wp14:pctHeight>
                 </wp14:sizeRelV>
               </wp:anchor>
             </w:drawing>
           </mc:Choice>
           <mc:Fallback>
             <w:pict>
-              <v:shapetype id="_x0000_t202" coordsize="21600,21600" o:spt="202" path="m,l,21600r21600,l21600,xe">
+              <v:shapetype w14:anchorId="4A20D2F3" id="_x0000_t202" coordsize="21600,21600" o:spt="202" path="m,l,21600r21600,l21600,xe">
                 <v:stroke joinstyle="miter"/>
                 <v:path gradientshapeok="t" o:connecttype="rect"/>
               </v:shapetype>
-              <v:shape id="Text Box 2" o:spid="_x0000_s1026" type="#_x0000_t202" style="position:absolute;left:0;text-align:left;margin-left:134.7pt;margin-top:.5pt;width:185.9pt;height:110.6pt;z-index:251659264;visibility:visible;mso-wrap-style:square;mso-width-percent:400;mso-height-percent:200;mso-wrap-distance-left:9pt;mso-wrap-distance-top:3.6pt;mso-wrap-distance-right:9pt;mso-wrap-distance-bottom:3.6pt;mso-position-horizontal:right;mso-position-horizontal-relative:margin;mso-position-vertical:absolute;mso-position-vertical-relative:text;mso-width-percent:400;mso-height-percent:200;mso-width-relative:margin;mso-height-relative:margin;v-text-anchor:top" o:gfxdata="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" stroked="f">
+              <v:shape id="Text Box 2" o:spid="_x0000_s1026" type="#_x0000_t202" style="position:absolute;margin-left:361.35pt;margin-top:12.7pt;width:360.85pt;height:110.6pt;z-index:251659264;visibility:visible;mso-wrap-style:square;mso-width-percent:0;mso-height-percent:0;mso-wrap-distance-left:9pt;mso-wrap-distance-top:3.6pt;mso-wrap-distance-right:9pt;mso-wrap-distance-bottom:3.6pt;mso-position-horizontal:absolute;mso-position-horizontal-relative:margin;mso-position-vertical:absolute;mso-position-vertical-relative:text;mso-width-percent:0;mso-height-percent:0;mso-width-relative:margin;mso-height-relative:margin;v-text-anchor:top" o:gfxdata="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" stroked="f">
                 <v:textbox style="mso-fit-shape-to-text:t">
                   <w:txbxContent>
                     <w:p>
@@ -524,6 +388,142 @@
           <w:sz w:val="22"/>
           <w:szCs w:val="22"/>
         </w:rPr>
+        <w:t xml:space="preserve">To: </w:t>
+      </w:r>
+      <w:r>
+        <w:rPr>
+          <w:rFonts w:eastAsia="Times New Roman" w:cs="Times New Roman"/>
+          <w:color w:val="auto"/>
+          <w:sz w:val="22"/>
+          <w:szCs w:val="22"/>
+        </w:rPr>
+        <w:fldChar w:fldCharType="begin"/>
+      </w:r>
+      <w:r>
+        <w:rPr>
+          <w:rFonts w:eastAsia="Times New Roman" w:cs="Times New Roman"/>
+          <w:color w:val="auto"/>
+          <w:sz w:val="22"/>
+          <w:szCs w:val="22"/>
+        </w:rPr>
+        <w:instrText xml:space="preserve"> MERGEFIELD  DisplayTitle  \* MERGEFORMAT </w:instrText>
+      </w:r>
+      <w:r>
+        <w:rPr>
+          <w:rFonts w:eastAsia="Times New Roman" w:cs="Times New Roman"/>
+          <w:color w:val="auto"/>
+          <w:sz w:val="22"/>
+          <w:szCs w:val="22"/>
+        </w:rPr>
+        <w:fldChar w:fldCharType="separate"/>
+      </w:r>
+      <w:r>
+        <w:rPr>
+          <w:rFonts w:eastAsia="Times New Roman" w:cs="Times New Roman"/>
+          <w:noProof/>
+          <w:color w:val="auto"/>
+          <w:sz w:val="22"/>
+          <w:szCs w:val="22"/>
+        </w:rPr>
+        <w:t>«DisplayTitle»</w:t>
+      </w:r>
+      <w:r>
+        <w:rPr>
+          <w:rFonts w:eastAsia="Times New Roman" w:cs="Times New Roman"/>
+          <w:color w:val="auto"/>
+          <w:sz w:val="22"/>
+          <w:szCs w:val="22"/>
+        </w:rPr>
+        <w:fldChar w:fldCharType="end"/>
+      </w:r>
+      <w:r>
+        <w:rPr>
+          <w:rFonts w:eastAsia="Times New Roman" w:cs="Times New Roman"/>
+          <w:color w:val="auto"/>
+          <w:sz w:val="22"/>
+          <w:szCs w:val="22"/>
+        </w:rPr>
+        <w:t xml:space="preserve"> - </w:t>
+      </w:r>
+      <w:r>
+        <w:rPr>
+          <w:rFonts w:eastAsia="Times New Roman" w:cs="Times New Roman"/>
+          <w:color w:val="auto"/>
+          <w:sz w:val="22"/>
+          <w:szCs w:val="22"/>
+        </w:rPr>
+        <w:fldChar w:fldCharType="begin"/>
+      </w:r>
+      <w:r>
+        <w:rPr>
+          <w:rFonts w:eastAsia="Times New Roman" w:cs="Times New Roman"/>
+          <w:color w:val="auto"/>
+          <w:sz w:val="22"/>
+          <w:szCs w:val="22"/>
+        </w:rPr>
+        <w:instrText xml:space="preserve"> MERGEFIELD  RoyaltyTier  \* MERGEFORMAT </w:instrText>
+      </w:r>
+      <w:r>
+        <w:rPr>
+          <w:rFonts w:eastAsia="Times New Roman" w:cs="Times New Roman"/>
+          <w:color w:val="auto"/>
+          <w:sz w:val="22"/>
+          <w:szCs w:val="22"/>
+        </w:rPr>
+        <w:fldChar w:fldCharType="separate"/>
+      </w:r>
+      <w:r>
+        <w:rPr>
+          <w:rFonts w:eastAsia="Times New Roman" w:cs="Times New Roman"/>
+          <w:noProof/>
+          <w:color w:val="auto"/>
+          <w:sz w:val="22"/>
+          <w:szCs w:val="22"/>
+        </w:rPr>
+        <w:t>«RoyaltyTier»</w:t>
+      </w:r>
+      <w:r>
+        <w:rPr>
+          <w:rFonts w:eastAsia="Times New Roman" w:cs="Times New Roman"/>
+          <w:color w:val="auto"/>
+          <w:sz w:val="22"/>
+          <w:szCs w:val="22"/>
+        </w:rPr>
+        <w:fldChar w:fldCharType="end"/>
+      </w:r>
+      <w:r>
+        <w:rPr>
+          <w:rFonts w:eastAsia="Times New Roman" w:cs="Times New Roman"/>
+          <w:color w:val="auto"/>
+          <w:sz w:val="22"/>
+          <w:szCs w:val="22"/>
+        </w:rPr>
+        <w:br/>
+        <w:t>Summary:</w:t>
+      </w:r>
+    </w:p>
+    <w:p>
+      <w:pPr>
+        <w:tabs>
+          <w:tab w:val="right" w:pos="3330"/>
+        </w:tabs>
+        <w:spacing w:before="0" w:after="200" w:line="276" w:lineRule="auto"/>
+        <w:ind w:right="0" w:firstLine="576"/>
+        <w:contextualSpacing/>
+        <w:rPr>
+          <w:rFonts w:eastAsia="Times New Roman" w:cs="Times New Roman"/>
+          <w:color w:val="auto"/>
+          <w:sz w:val="22"/>
+          <w:szCs w:val="22"/>
+        </w:rPr>
+      </w:pPr>
+      <w:r>
+        <w:rPr>
+          <w:rFonts w:eastAsia="Times New Roman" w:cs="Times New Roman"/>
+          <w:color w:val="auto"/>
+          <w:sz w:val="22"/>
+          <w:szCs w:val="22"/>
+        </w:rPr>
         <w:t xml:space="preserve">Grand Total Revenue Billed: </w:t>
       </w:r>
       <w:fldSimple w:instr=" MERGEFIELD  GrandTotalOnBilled  \* MERGEFORMAT ">
@@ -631,31 +631,6 @@
           <w:szCs w:val="22"/>
         </w:rPr>
       </w:pPr>
-    </w:p>
-    <w:p>
-      <w:pPr>
-        <w:tabs>
-          <w:tab w:val="right" w:pos="12780"/>
-        </w:tabs>
-        <w:spacing w:before="0" w:after="200" w:line="276" w:lineRule="auto"/>
-        <w:ind w:left="0" w:right="0"/>
-        <w:contextualSpacing/>
-        <w:rPr>
-          <w:rFonts w:eastAsia="Times New Roman" w:cs="Times New Roman"/>
-          <w:color w:val="auto"/>
-          <w:sz w:val="22"/>
-          <w:szCs w:val="22"/>
-        </w:rPr>
-      </w:pPr>
-      <w:r>
-        <w:rPr>
-          <w:rFonts w:eastAsia="Times New Roman" w:cs="Times New Roman"/>
-          <w:color w:val="auto"/>
-          <w:sz w:val="22"/>
-          <w:szCs w:val="22"/>
-        </w:rPr>
-        <w:t>Details:</w:t>
-      </w:r>
     </w:p>
     <w:p>
       <w:pPr>
@@ -1118,118 +1093,47 @@
           </w:tcPr>
           <w:p>
             <w:pPr>
-              <w:spacing w:before="0" w:after="0" w:line="276" w:lineRule="auto"/>
-              <w:ind w:left="0" w:right="2180"/>
-              <w:contextualSpacing/>
               <w:jc w:val="right"/>
-              <w:rPr>
-                <w:rFonts w:eastAsia="Times New Roman" w:cs="Times New Roman"/>
-                <w:color w:val="auto"/>
-                <w:sz w:val="22"/>
-                <w:szCs w:val="22"/>
-              </w:rPr>
             </w:pPr>
             <w:r>
-              <w:rPr>
-                <w:rFonts w:eastAsia="Times New Roman" w:cs="Times New Roman"/>
-                <w:color w:val="auto"/>
-                <w:sz w:val="22"/>
-                <w:szCs w:val="22"/>
-              </w:rPr>
-              <w:lastRenderedPageBreak/>
               <w:fldChar w:fldCharType="begin"/>
             </w:r>
             <w:r>
-              <w:rPr>
-                <w:rFonts w:eastAsia="Times New Roman" w:cs="Times New Roman"/>
-                <w:color w:val="auto"/>
-                <w:sz w:val="22"/>
-                <w:szCs w:val="22"/>
-              </w:rPr>
               <w:instrText xml:space="preserve"> MERGEFIELD  RangeStart:Orders  \* MERGEFORMAT </w:instrText>
             </w:r>
             <w:r>
-              <w:rPr>
-                <w:rFonts w:eastAsia="Times New Roman" w:cs="Times New Roman"/>
-                <w:color w:val="auto"/>
-                <w:sz w:val="22"/>
-                <w:szCs w:val="22"/>
-              </w:rPr>
               <w:fldChar w:fldCharType="separate"/>
             </w:r>
             <w:r>
               <w:rPr>
-                <w:rFonts w:eastAsia="Times New Roman" w:cs="Times New Roman"/>
                 <w:noProof/>
-                <w:color w:val="auto"/>
-                <w:sz w:val="22"/>
-                <w:szCs w:val="22"/>
               </w:rPr>
               <w:t>«RangeStart:Orders»</w:t>
             </w:r>
             <w:r>
               <w:rPr>
-                <w:rFonts w:eastAsia="Times New Roman" w:cs="Times New Roman"/>
-                <w:color w:val="auto"/>
-                <w:sz w:val="22"/>
-                <w:szCs w:val="22"/>
+                <w:noProof/>
               </w:rPr>
               <w:fldChar w:fldCharType="end"/>
             </w:r>
             <w:r>
-              <w:rPr>
-                <w:rFonts w:eastAsia="Times New Roman" w:cs="Times New Roman"/>
-                <w:color w:val="auto"/>
-                <w:sz w:val="22"/>
-                <w:szCs w:val="22"/>
-              </w:rPr>
               <w:fldChar w:fldCharType="begin"/>
             </w:r>
             <w:r>
-              <w:rPr>
-                <w:rFonts w:eastAsia="Times New Roman" w:cs="Times New Roman"/>
-                <w:color w:val="auto"/>
-                <w:sz w:val="22"/>
-                <w:szCs w:val="22"/>
-              </w:rPr>
               <w:instrText xml:space="preserve"> MERGEFIELD  RowNumber \f .  \* MERGEFORMAT </w:instrText>
             </w:r>
             <w:r>
-              <w:rPr>
-                <w:rFonts w:eastAsia="Times New Roman" w:cs="Times New Roman"/>
-                <w:color w:val="auto"/>
-                <w:sz w:val="22"/>
-                <w:szCs w:val="22"/>
-              </w:rPr>
               <w:fldChar w:fldCharType="separate"/>
             </w:r>
             <w:r>
               <w:rPr>
-                <w:rFonts w:eastAsia="Times New Roman" w:cs="Times New Roman"/>
                 <w:noProof/>
-                <w:color w:val="auto"/>
-                <w:sz w:val="22"/>
-                <w:szCs w:val="22"/>
-              </w:rPr>
-              <w:t>«RowNumber</w:t>
-            </w:r>
-            <w:r>
-              <w:rPr>
-                <w:rFonts w:eastAsia="Times New Roman" w:cs="Times New Roman"/>
+              </w:rPr>
+              <w:t>«RowNumber».</w:t>
+            </w:r>
+            <w:r>
+              <w:rPr>
                 <w:noProof/>
-                <w:color w:val="auto"/>
-                <w:sz w:val="22"/>
-                <w:szCs w:val="22"/>
-              </w:rPr>
-              <w:lastRenderedPageBreak/>
-              <w:t>».</w:t>
-            </w:r>
-            <w:r>
-              <w:rPr>
-                <w:rFonts w:eastAsia="Times New Roman" w:cs="Times New Roman"/>
-                <w:color w:val="auto"/>
-                <w:sz w:val="22"/>
-                <w:szCs w:val="22"/>
               </w:rPr>
               <w:fldChar w:fldCharType="end"/>
             </w:r>
@@ -1258,7 +1162,6 @@
                 <w:sz w:val="22"/>
                 <w:szCs w:val="22"/>
               </w:rPr>
-              <w:lastRenderedPageBreak/>
               <w:fldChar w:fldCharType="begin"/>
             </w:r>
             <w:r>
@@ -1288,6 +1191,61 @@
                 <w:szCs w:val="22"/>
               </w:rPr>
               <w:t>«Name»</w:t>
+            </w:r>
+            <w:r>
+              <w:rPr>
+                <w:rFonts w:eastAsia="Times New Roman" w:cs="Times New Roman"/>
+                <w:color w:val="auto"/>
+                <w:sz w:val="22"/>
+                <w:szCs w:val="22"/>
+              </w:rPr>
+              <w:fldChar w:fldCharType="end"/>
+            </w:r>
+            <w:r>
+              <w:rPr>
+                <w:rFonts w:eastAsia="Times New Roman" w:cs="Times New Roman"/>
+                <w:color w:val="auto"/>
+                <w:sz w:val="22"/>
+                <w:szCs w:val="22"/>
+              </w:rPr>
+              <w:t xml:space="preserve"> - </w:t>
+            </w:r>
+            <w:r>
+              <w:rPr>
+                <w:rFonts w:eastAsia="Times New Roman" w:cs="Times New Roman"/>
+                <w:color w:val="auto"/>
+                <w:sz w:val="22"/>
+                <w:szCs w:val="22"/>
+              </w:rPr>
+              <w:fldChar w:fldCharType="begin"/>
+            </w:r>
+            <w:r>
+              <w:rPr>
+                <w:rFonts w:eastAsia="Times New Roman" w:cs="Times New Roman"/>
+                <w:color w:val="auto"/>
+                <w:sz w:val="22"/>
+                <w:szCs w:val="22"/>
+              </w:rPr>
+              <w:instrText xml:space="preserve"> MERGEFIELD  Email  \* MERGEFORMAT </w:instrText>
+            </w:r>
+            <w:r>
+              <w:rPr>
+                <w:rFonts w:eastAsia="Times New Roman" w:cs="Times New Roman"/>
+                <w:color w:val="auto"/>
+                <w:sz w:val="22"/>
+                <w:szCs w:val="22"/>
+              </w:rPr>
+              <w:fldChar w:fldCharType="separate"/>
+            </w:r>
+            <w:r>
+              <w:rPr>
+                <w:rFonts w:eastAsia="Times New Roman" w:cs="Times New Roman"/>
+                <w:noProof/>
+                <w:color w:val="auto"/>
+                <w:sz w:val="22"/>
+                <w:szCs w:val="22"/>
+              </w:rPr>
+              <w:t>«Email»</w:t>
             </w:r>
             <w:r>
               <w:rPr>
@@ -1327,7 +1285,7 @@
                 <w:sz w:val="22"/>
                 <w:szCs w:val="22"/>
               </w:rPr>
-              <w:instrText xml:space="preserve"> MERGEFIELD  Email  \* MERGEFORMAT </w:instrText>
+              <w:instrText xml:space="preserve"> MERGEFIELD  Address  \* MERGEFORMAT </w:instrText>
             </w:r>
             <w:r>
               <w:rPr>
@@ -1346,66 +1304,7 @@
                 <w:sz w:val="22"/>
                 <w:szCs w:val="22"/>
               </w:rPr>
-              <w:t>«Email»</w:t>
-            </w:r>
-            <w:r>
-              <w:rPr>
-                <w:rFonts w:eastAsia="Times New Roman" w:cs="Times New Roman"/>
-                <w:color w:val="auto"/>
-                <w:sz w:val="22"/>
-                <w:szCs w:val="22"/>
-              </w:rPr>
-              <w:fldChar w:fldCharType="end"/>
-            </w:r>
-          </w:p>
-          <w:p>
-            <w:pPr>
-              <w:spacing w:before="0" w:after="200" w:line="276" w:lineRule="auto"/>
-              <w:ind w:left="0" w:right="0"/>
-              <w:contextualSpacing/>
-              <w:rPr>
-                <w:rFonts w:eastAsia="Times New Roman" w:cs="Times New Roman"/>
-                <w:color w:val="auto"/>
-                <w:sz w:val="22"/>
-                <w:szCs w:val="22"/>
-              </w:rPr>
-            </w:pPr>
-            <w:r>
-              <w:rPr>
-                <w:rFonts w:eastAsia="Times New Roman" w:cs="Times New Roman"/>
-                <w:color w:val="auto"/>
-                <w:sz w:val="22"/>
-                <w:szCs w:val="22"/>
-              </w:rPr>
-              <w:fldChar w:fldCharType="begin"/>
-            </w:r>
-            <w:r>
-              <w:rPr>
-                <w:rFonts w:eastAsia="Times New Roman" w:cs="Times New Roman"/>
-                <w:color w:val="auto"/>
-                <w:sz w:val="22"/>
-                <w:szCs w:val="22"/>
-              </w:rPr>
-              <w:instrText xml:space="preserve"> MERGEFIELD  Institution  \* MERGEFORMAT </w:instrText>
-            </w:r>
-            <w:r>
-              <w:rPr>
-                <w:rFonts w:eastAsia="Times New Roman" w:cs="Times New Roman"/>
-                <w:color w:val="auto"/>
-                <w:sz w:val="22"/>
-                <w:szCs w:val="22"/>
-              </w:rPr>
-              <w:fldChar w:fldCharType="separate"/>
-            </w:r>
-            <w:r>
-              <w:rPr>
-                <w:rFonts w:eastAsia="Times New Roman" w:cs="Times New Roman"/>
-                <w:noProof/>
-                <w:color w:val="auto"/>
-                <w:sz w:val="22"/>
-                <w:szCs w:val="22"/>
-              </w:rPr>
-              <w:t>«Institution»</w:t>
+              <w:t>«Address»</w:t>
             </w:r>
             <w:r>
               <w:rPr>
@@ -1803,6 +1702,21 @@
           <w:szCs w:val="22"/>
         </w:rPr>
       </w:pPr>
+    </w:p>
+    <w:p>
+      <w:pPr>
+        <w:keepLines/>
+        <w:spacing w:before="0" w:after="200" w:line="276" w:lineRule="auto"/>
+        <w:ind w:left="720" w:right="0"/>
+        <w:contextualSpacing/>
+        <w:rPr>
+          <w:rFonts w:eastAsia="Times New Roman" w:cs="Times New Roman"/>
+          <w:color w:val="auto"/>
+          <w:sz w:val="22"/>
+          <w:szCs w:val="22"/>
+        </w:rPr>
+      </w:pPr>
+      <w:bookmarkStart w:id="0" w:name="_GoBack"/>
       <w:r>
         <w:rPr>
           <w:rFonts w:eastAsia="Times New Roman" w:cs="Times New Roman"/>
@@ -1823,8 +1737,9 @@
     </w:p>
     <w:p>
       <w:pPr>
+        <w:keepLines/>
         <w:spacing w:before="0" w:after="200" w:line="276" w:lineRule="auto"/>
-        <w:ind w:left="0" w:right="0"/>
+        <w:ind w:left="720" w:right="0"/>
         <w:contextualSpacing/>
       </w:pPr>
       <w:r>
@@ -1850,8 +1765,9 @@
     </w:p>
     <w:p>
       <w:pPr>
+        <w:keepLines/>
         <w:spacing w:before="0" w:after="200" w:line="276" w:lineRule="auto"/>
-        <w:ind w:left="0" w:right="0"/>
+        <w:ind w:left="720" w:right="0"/>
         <w:contextualSpacing/>
       </w:pPr>
       <w:r>
@@ -1870,10 +1786,7 @@
         <w:fldChar w:fldCharType="begin"/>
       </w:r>
       <w:r>
-        <w:instrText xml:space="preserve"> MERGEFIELD  Tot</w:instrText>
-      </w:r>
-      <w:r>
-        <w:instrText xml:space="preserve">alRoyalties  \* MERGEFORMAT </w:instrText>
+        <w:instrText xml:space="preserve"> MERGEFIELD  TotalRoyalties  \* MERGEFORMAT </w:instrText>
       </w:r>
       <w:r>
         <w:fldChar w:fldCharType="separate"/>
@@ -1893,8 +1806,9 @@
     </w:p>
     <w:p>
       <w:pPr>
+        <w:keepLines/>
         <w:spacing w:before="0" w:after="200" w:line="276" w:lineRule="auto"/>
-        <w:ind w:left="0" w:right="0"/>
+        <w:ind w:left="720" w:right="0"/>
         <w:contextualSpacing/>
       </w:pPr>
       <w:r>
@@ -1918,16 +1832,15 @@
         </w:r>
       </w:fldSimple>
     </w:p>
+    <w:bookmarkEnd w:id="0"/>
     <w:p>
       <w:pPr>
         <w:spacing w:before="0" w:after="200" w:line="276" w:lineRule="auto"/>
         <w:ind w:left="0" w:right="0"/>
         <w:contextualSpacing/>
         <w:rPr>
-          <w:rFonts w:eastAsia="Times New Roman" w:cs="Times New Roman"/>
-          <w:color w:val="auto"/>
-          <w:sz w:val="22"/>
-          <w:szCs w:val="22"/>
+          <w:noProof/>
+          <w:color w:val="000000" w:themeColor="text1"/>
         </w:rPr>
       </w:pPr>
       <w:r>
@@ -1966,6 +1879,65 @@
           <w:szCs w:val="22"/>
         </w:rPr>
         <w:t>«RangeEnd:Webinars»</w:t>
+      </w:r>
+      <w:r>
+        <w:rPr>
+          <w:rFonts w:eastAsia="Times New Roman" w:cs="Times New Roman"/>
+          <w:color w:val="auto"/>
+          <w:sz w:val="22"/>
+          <w:szCs w:val="22"/>
+        </w:rPr>
+        <w:fldChar w:fldCharType="end"/>
+      </w:r>
+    </w:p>
+    <w:p>
+      <w:pPr>
+        <w:spacing w:before="0" w:after="200" w:line="276" w:lineRule="auto"/>
+        <w:ind w:left="0" w:right="0"/>
+        <w:contextualSpacing/>
+        <w:rPr>
+          <w:rFonts w:eastAsia="Times New Roman" w:cs="Times New Roman"/>
+          <w:color w:val="auto"/>
+          <w:sz w:val="22"/>
+          <w:szCs w:val="22"/>
+        </w:rPr>
+      </w:pPr>
+      <w:r>
+        <w:rPr>
+          <w:rFonts w:eastAsia="Times New Roman" w:cs="Times New Roman"/>
+          <w:color w:val="auto"/>
+          <w:sz w:val="22"/>
+          <w:szCs w:val="22"/>
+        </w:rPr>
+        <w:fldChar w:fldCharType="begin"/>
+      </w:r>
+      <w:r>
+        <w:rPr>
+          <w:rFonts w:eastAsia="Times New Roman" w:cs="Times New Roman"/>
+          <w:color w:val="auto"/>
+          <w:sz w:val="22"/>
+          <w:szCs w:val="22"/>
+        </w:rPr>
+        <w:instrText xml:space="preserve"> MERGEFIELD  RangeStart:PostEventOrders  \* MERGEFORMAT </w:instrText>
+      </w:r>
+      <w:r>
+        <w:rPr>
+          <w:rFonts w:eastAsia="Times New Roman" w:cs="Times New Roman"/>
+          <w:color w:val="auto"/>
+          <w:sz w:val="22"/>
+          <w:szCs w:val="22"/>
+        </w:rPr>
+        <w:fldChar w:fldCharType="separate"/>
+      </w:r>
+      <w:r>
+        <w:rPr>
+          <w:rFonts w:eastAsia="Times New Roman" w:cs="Times New Roman"/>
+          <w:noProof/>
+          <w:color w:val="auto"/>
+          <w:sz w:val="22"/>
+          <w:szCs w:val="22"/>
+        </w:rPr>
+        <w:t>«RangeStart:PostEventOrders»</w:t>
       </w:r>
       <w:r>
         <w:rPr>
@@ -2009,8 +1981,10 @@
         <w:ind w:left="0" w:right="0"/>
         <w:contextualSpacing/>
         <w:rPr>
-          <w:noProof/>
-          <w:color w:val="000000" w:themeColor="text1"/>
+          <w:rFonts w:eastAsia="Times New Roman" w:cs="Times New Roman"/>
+          <w:color w:val="auto"/>
+          <w:sz w:val="22"/>
+          <w:szCs w:val="22"/>
         </w:rPr>
       </w:pPr>
     </w:p>
@@ -2026,52 +2000,6 @@
           <w:szCs w:val="22"/>
         </w:rPr>
       </w:pPr>
-      <w:r>
-        <w:rPr>
-          <w:rFonts w:eastAsia="Times New Roman" w:cs="Times New Roman"/>
-          <w:color w:val="auto"/>
-          <w:sz w:val="22"/>
-          <w:szCs w:val="22"/>
-        </w:rPr>
-        <w:fldChar w:fldCharType="begin"/>
-      </w:r>
-      <w:r>
-        <w:rPr>
-          <w:rFonts w:eastAsia="Times New Roman" w:cs="Times New Roman"/>
-          <w:color w:val="auto"/>
-          <w:sz w:val="22"/>
-          <w:szCs w:val="22"/>
-        </w:rPr>
-        <w:instrText xml:space="preserve"> MERGEFIELD  RangeStart:PostEventOrders  \* MERGEFORMAT </w:instrText>
-      </w:r>
-      <w:r>
-        <w:rPr>
-          <w:rFonts w:eastAsia="Times New Roman" w:cs="Times New Roman"/>
-          <w:color w:val="auto"/>
-          <w:sz w:val="22"/>
-          <w:szCs w:val="22"/>
-        </w:rPr>
-        <w:fldChar w:fldCharType="separate"/>
-      </w:r>
-      <w:r>
-        <w:rPr>
-          <w:rFonts w:eastAsia="Times New Roman" w:cs="Times New Roman"/>
-          <w:noProof/>
-          <w:color w:val="auto"/>
-          <w:sz w:val="22"/>
-          <w:szCs w:val="22"/>
-        </w:rPr>
-        <w:t>«RangeStart:PostEventOrders»</w:t>
-      </w:r>
-      <w:r>
-        <w:rPr>
-          <w:rFonts w:eastAsia="Times New Roman" w:cs="Times New Roman"/>
-          <w:color w:val="auto"/>
-          <w:sz w:val="22"/>
-          <w:szCs w:val="22"/>
-        </w:rPr>
-        <w:fldChar w:fldCharType="end"/>
-      </w:r>
     </w:p>
     <w:p>
       <w:pPr>
@@ -2083,8 +2011,8 @@
           <w:b/>
           <w:i/>
           <w:color w:val="auto"/>
-          <w:sz w:val="22"/>
-          <w:szCs w:val="22"/>
+          <w:sz w:val="26"/>
+          <w:szCs w:val="26"/>
         </w:rPr>
       </w:pPr>
       <w:r>
@@ -2093,10 +2021,74 @@
           <w:b/>
           <w:i/>
           <w:color w:val="auto"/>
-          <w:sz w:val="22"/>
-          <w:szCs w:val="22"/>
-        </w:rPr>
-        <w:t>Orders for past events</w:t>
+          <w:sz w:val="26"/>
+          <w:szCs w:val="26"/>
+        </w:rPr>
+        <w:t>Orders for P</w:t>
+      </w:r>
+      <w:r>
+        <w:rPr>
+          <w:rFonts w:eastAsia="Times New Roman" w:cs="Times New Roman"/>
+          <w:b/>
+          <w:i/>
+          <w:color w:val="auto"/>
+          <w:sz w:val="26"/>
+          <w:szCs w:val="26"/>
+        </w:rPr>
+        <w:t xml:space="preserve">ast </w:t>
+      </w:r>
+      <w:proofErr w:type="gramStart"/>
+      <w:r>
+        <w:rPr>
+          <w:rFonts w:eastAsia="Times New Roman" w:cs="Times New Roman"/>
+          <w:b/>
+          <w:i/>
+          <w:color w:val="auto"/>
+          <w:sz w:val="26"/>
+          <w:szCs w:val="26"/>
+        </w:rPr>
+        <w:t>E</w:t>
+      </w:r>
+      <w:r>
+        <w:rPr>
+          <w:rFonts w:eastAsia="Times New Roman" w:cs="Times New Roman"/>
+          <w:b/>
+          <w:i/>
+          <w:color w:val="auto"/>
+          <w:sz w:val="26"/>
+          <w:szCs w:val="26"/>
+        </w:rPr>
+        <w:t>vents</w:t>
+      </w:r>
+      <w:r>
+        <w:rPr>
+          <w:rFonts w:eastAsia="Times New Roman" w:cs="Times New Roman"/>
+          <w:b/>
+          <w:i/>
+          <w:color w:val="auto"/>
+          <w:sz w:val="26"/>
+          <w:szCs w:val="26"/>
+        </w:rPr>
+        <w:t xml:space="preserve"> </w:t>
+      </w:r>
+      <w:r>
+        <w:rPr>
+          <w:rFonts w:eastAsia="Times New Roman" w:cs="Times New Roman"/>
+          <w:color w:val="auto"/>
+          <w:sz w:val="22"/>
+          <w:szCs w:val="22"/>
+        </w:rPr>
+        <w:t xml:space="preserve"> (</w:t>
+      </w:r>
+      <w:proofErr w:type="gramEnd"/>
+      <w:r>
+        <w:rPr>
+          <w:rFonts w:eastAsia="Times New Roman" w:cs="Times New Roman"/>
+          <w:color w:val="auto"/>
+          <w:sz w:val="22"/>
+          <w:szCs w:val="22"/>
+        </w:rPr>
+        <w:t>orders that arrived following the event’s start)</w:t>
       </w:r>
     </w:p>
     <w:tbl>
@@ -2293,121 +2285,46 @@
         <w:tc>
           <w:tcPr>
             <w:tcW w:w="200" w:type="pct"/>
-            <w:vAlign w:val="center"/>
           </w:tcPr>
           <w:p>
             <w:pPr>
-              <w:spacing w:before="0" w:after="200" w:line="276" w:lineRule="auto"/>
-              <w:ind w:left="0" w:right="2180"/>
-              <w:contextualSpacing/>
               <w:jc w:val="right"/>
-              <w:rPr>
-                <w:rFonts w:eastAsia="Times New Roman" w:cs="Times New Roman"/>
-                <w:color w:val="auto"/>
-                <w:sz w:val="22"/>
-                <w:szCs w:val="22"/>
-              </w:rPr>
             </w:pPr>
-            <w:r>
-              <w:rPr>
-                <w:rFonts w:eastAsia="Times New Roman" w:cs="Times New Roman"/>
-                <w:color w:val="auto"/>
-                <w:sz w:val="22"/>
-                <w:szCs w:val="22"/>
-              </w:rPr>
+            <w:fldSimple w:instr=" MERGEFIELD  RangeStart:pOrders  \* MERGEFORMAT ">
+              <w:r>
+                <w:rPr>
+                  <w:noProof/>
+                </w:rPr>
+                <w:t>«</w:t>
+              </w:r>
+              <w:r>
+                <w:t>RangeStart</w:t>
+              </w:r>
+              <w:r>
+                <w:rPr>
+                  <w:noProof/>
+                </w:rPr>
+                <w:t>:pOrders»</w:t>
+              </w:r>
+            </w:fldSimple>
+            <w:r>
               <w:fldChar w:fldCharType="begin"/>
             </w:r>
             <w:r>
-              <w:rPr>
-                <w:rFonts w:eastAsia="Times New Roman" w:cs="Times New Roman"/>
-                <w:color w:val="auto"/>
-                <w:sz w:val="22"/>
-                <w:szCs w:val="22"/>
-              </w:rPr>
-              <w:instrText xml:space="preserve"> MERGEFIELD  RangeStart:pOrders  \* MERGEFORMAT </w:instrText>
-            </w:r>
-            <w:r>
-              <w:rPr>
-                <w:rFonts w:eastAsia="Times New Roman" w:cs="Times New Roman"/>
-                <w:color w:val="auto"/>
-                <w:sz w:val="22"/>
-                <w:szCs w:val="22"/>
-              </w:rPr>
+              <w:instrText xml:space="preserve"> MERGEFIELD  RowNumber \f .  \* MERGEFORMAT </w:instrText>
+            </w:r>
+            <w:r>
               <w:fldChar w:fldCharType="separate"/>
             </w:r>
             <w:r>
               <w:rPr>
-                <w:rFonts w:eastAsia="Times New Roman" w:cs="Times New Roman"/>
                 <w:noProof/>
-                <w:color w:val="auto"/>
-                <w:sz w:val="22"/>
-                <w:szCs w:val="22"/>
-              </w:rPr>
-              <w:t>«RangeStart:pOrde</w:t>
-            </w:r>
-            <w:r>
-              <w:rPr>
-                <w:rFonts w:eastAsia="Times New Roman" w:cs="Times New Roman"/>
+              </w:rPr>
+              <w:t>«RowNumber».</w:t>
+            </w:r>
+            <w:r>
+              <w:rPr>
                 <w:noProof/>
-                <w:color w:val="auto"/>
-                <w:sz w:val="22"/>
-                <w:szCs w:val="22"/>
-              </w:rPr>
-              <w:lastRenderedPageBreak/>
-              <w:t>rs»</w:t>
-            </w:r>
-            <w:r>
-              <w:rPr>
-                <w:rFonts w:eastAsia="Times New Roman" w:cs="Times New Roman"/>
-                <w:color w:val="auto"/>
-                <w:sz w:val="22"/>
-                <w:szCs w:val="22"/>
-              </w:rPr>
-              <w:fldChar w:fldCharType="end"/>
-            </w:r>
-            <w:r>
-              <w:rPr>
-                <w:rFonts w:eastAsia="Times New Roman" w:cs="Times New Roman"/>
-                <w:color w:val="auto"/>
-                <w:sz w:val="22"/>
-                <w:szCs w:val="22"/>
-              </w:rPr>
-              <w:fldChar w:fldCharType="begin"/>
-            </w:r>
-            <w:r>
-              <w:rPr>
-                <w:rFonts w:eastAsia="Times New Roman" w:cs="Times New Roman"/>
-                <w:color w:val="auto"/>
-                <w:sz w:val="22"/>
-                <w:szCs w:val="22"/>
-              </w:rPr>
-              <w:instrText xml:space="preserve"> MERGEFIELD  RowNumber \f .  \* MERGEFORMAT </w:instrText>
-            </w:r>
-            <w:r>
-              <w:rPr>
-                <w:rFonts w:eastAsia="Times New Roman" w:cs="Times New Roman"/>
-                <w:color w:val="auto"/>
-                <w:sz w:val="22"/>
-                <w:szCs w:val="22"/>
-              </w:rPr>
-              <w:fldChar w:fldCharType="separate"/>
-            </w:r>
-            <w:r>
-              <w:rPr>
-                <w:rFonts w:eastAsia="Times New Roman" w:cs="Times New Roman"/>
-                <w:noProof/>
-                <w:color w:val="auto"/>
-                <w:sz w:val="22"/>
-                <w:szCs w:val="22"/>
-              </w:rPr>
-              <w:t>«RowNumber».</w:t>
-            </w:r>
-            <w:r>
-              <w:rPr>
-                <w:rFonts w:eastAsia="Times New Roman" w:cs="Times New Roman"/>
-                <w:color w:val="auto"/>
-                <w:sz w:val="22"/>
-                <w:szCs w:val="22"/>
               </w:rPr>
               <w:fldChar w:fldCharType="end"/>
             </w:r>
@@ -2438,7 +2355,6 @@
                 <w:sz w:val="22"/>
                 <w:szCs w:val="22"/>
               </w:rPr>
-              <w:lastRenderedPageBreak/>
               <w:fldChar w:fldCharType="begin"/>
             </w:r>
             <w:r>
@@ -2541,6 +2457,88 @@
               </w:rPr>
               <w:fldChar w:fldCharType="end"/>
             </w:r>
+            <w:r>
+              <w:rPr>
+                <w:rFonts w:eastAsia="Times New Roman" w:cs="Times New Roman"/>
+                <w:color w:val="auto"/>
+                <w:sz w:val="22"/>
+                <w:szCs w:val="22"/>
+              </w:rPr>
+              <w:t xml:space="preserve"> - </w:t>
+            </w:r>
+            <w:r>
+              <w:rPr>
+                <w:rFonts w:eastAsia="Times New Roman" w:cs="Times New Roman"/>
+                <w:color w:val="auto"/>
+                <w:sz w:val="22"/>
+                <w:szCs w:val="22"/>
+              </w:rPr>
+              <w:fldChar w:fldCharType="begin"/>
+            </w:r>
+            <w:r>
+              <w:rPr>
+                <w:rFonts w:eastAsia="Times New Roman" w:cs="Times New Roman"/>
+                <w:color w:val="auto"/>
+                <w:sz w:val="22"/>
+                <w:szCs w:val="22"/>
+              </w:rPr>
+              <w:instrText xml:space="preserve"> MERGEFIELD  Email  \* MERGEFORMAT </w:instrText>
+            </w:r>
+            <w:r>
+              <w:rPr>
+                <w:rFonts w:eastAsia="Times New Roman" w:cs="Times New Roman"/>
+                <w:color w:val="auto"/>
+                <w:sz w:val="22"/>
+                <w:szCs w:val="22"/>
+              </w:rPr>
+              <w:fldChar w:fldCharType="separate"/>
+            </w:r>
+            <w:r>
+              <w:rPr>
+                <w:rFonts w:eastAsia="Times New Roman" w:cs="Times New Roman"/>
+                <w:noProof/>
+                <w:color w:val="auto"/>
+                <w:sz w:val="22"/>
+                <w:szCs w:val="22"/>
+              </w:rPr>
+              <w:t>«Email»</w:t>
+            </w:r>
+            <w:r>
+              <w:rPr>
+                <w:rFonts w:eastAsia="Times New Roman" w:cs="Times New Roman"/>
+                <w:color w:val="auto"/>
+                <w:sz w:val="22"/>
+                <w:szCs w:val="22"/>
+              </w:rPr>
+              <w:fldChar w:fldCharType="end"/>
+            </w:r>
+            <w:r>
+              <w:rPr>
+                <w:rFonts w:eastAsia="Times New Roman" w:cs="Times New Roman"/>
+                <w:color w:val="auto"/>
+                <w:sz w:val="22"/>
+                <w:szCs w:val="22"/>
+              </w:rPr>
+              <w:fldChar w:fldCharType="begin"/>
+            </w:r>
+            <w:r>
+              <w:rPr>
+                <w:rFonts w:eastAsia="Times New Roman" w:cs="Times New Roman"/>
+                <w:color w:val="auto"/>
+                <w:sz w:val="22"/>
+                <w:szCs w:val="22"/>
+              </w:rPr>
+              <w:instrText xml:space="preserve"> MERGEFIELD  Institution  \* MERGEFORMAT </w:instrText>
+            </w:r>
+            <w:r>
+              <w:rPr>
+                <w:rFonts w:eastAsia="Times New Roman" w:cs="Times New Roman"/>
+                <w:color w:val="auto"/>
+                <w:sz w:val="22"/>
+                <w:szCs w:val="22"/>
+              </w:rPr>
+              <w:fldChar w:fldCharType="end"/>
+            </w:r>
           </w:p>
           <w:p>
             <w:pPr>
@@ -2570,7 +2568,7 @@
                 <w:sz w:val="22"/>
                 <w:szCs w:val="22"/>
               </w:rPr>
-              <w:instrText xml:space="preserve"> MERGEFIELD  Email  \* MERGEFORMAT </w:instrText>
+              <w:instrText xml:space="preserve"> MERGEFIELD  Address  \* MERGEFORMAT </w:instrText>
             </w:r>
             <w:r>
               <w:rPr>
@@ -2589,66 +2587,7 @@
                 <w:sz w:val="22"/>
                 <w:szCs w:val="22"/>
               </w:rPr>
-              <w:t>«Email»</w:t>
-            </w:r>
-            <w:r>
-              <w:rPr>
-                <w:rFonts w:eastAsia="Times New Roman" w:cs="Times New Roman"/>
-                <w:color w:val="auto"/>
-                <w:sz w:val="22"/>
-                <w:szCs w:val="22"/>
-              </w:rPr>
-              <w:fldChar w:fldCharType="end"/>
-            </w:r>
-          </w:p>
-          <w:p>
-            <w:pPr>
-              <w:spacing w:before="0" w:after="200" w:line="276" w:lineRule="auto"/>
-              <w:ind w:left="0" w:right="0"/>
-              <w:contextualSpacing/>
-              <w:rPr>
-                <w:rFonts w:eastAsia="Times New Roman" w:cs="Times New Roman"/>
-                <w:color w:val="auto"/>
-                <w:sz w:val="22"/>
-                <w:szCs w:val="22"/>
-              </w:rPr>
-            </w:pPr>
-            <w:r>
-              <w:rPr>
-                <w:rFonts w:eastAsia="Times New Roman" w:cs="Times New Roman"/>
-                <w:color w:val="auto"/>
-                <w:sz w:val="22"/>
-                <w:szCs w:val="22"/>
-              </w:rPr>
-              <w:fldChar w:fldCharType="begin"/>
-            </w:r>
-            <w:r>
-              <w:rPr>
-                <w:rFonts w:eastAsia="Times New Roman" w:cs="Times New Roman"/>
-                <w:color w:val="auto"/>
-                <w:sz w:val="22"/>
-                <w:szCs w:val="22"/>
-              </w:rPr>
-              <w:instrText xml:space="preserve"> MERGEFIELD  Institution  \* MERGEFORMAT </w:instrText>
-            </w:r>
-            <w:r>
-              <w:rPr>
-                <w:rFonts w:eastAsia="Times New Roman" w:cs="Times New Roman"/>
-                <w:color w:val="auto"/>
-                <w:sz w:val="22"/>
-                <w:szCs w:val="22"/>
-              </w:rPr>
-              <w:fldChar w:fldCharType="separate"/>
-            </w:r>
-            <w:r>
-              <w:rPr>
-                <w:rFonts w:eastAsia="Times New Roman" w:cs="Times New Roman"/>
-                <w:noProof/>
-                <w:color w:val="auto"/>
-                <w:sz w:val="22"/>
-                <w:szCs w:val="22"/>
-              </w:rPr>
-              <w:t>«Institution»</w:t>
+              <w:t>«Address»</w:t>
             </w:r>
             <w:r>
               <w:rPr>
@@ -3137,8 +3076,6 @@
         </w:rPr>
         <w:fldChar w:fldCharType="end"/>
       </w:r>
-      <w:bookmarkStart w:id="0" w:name="_GoBack"/>
-      <w:bookmarkEnd w:id="0"/>
     </w:p>
     <w:p>
       <w:pPr>
@@ -3715,7 +3652,7 @@
   <w:style w:type="paragraph" w:default="1" w:styleId="Normal">
     <w:name w:val="Normal"/>
     <w:qFormat/>
-    <w:rsid w:val="00856F81"/>
+    <w:rsid w:val="00E94BB3"/>
     <w:pPr>
       <w:spacing w:before="60" w:after="60" w:line="240" w:lineRule="auto"/>
       <w:ind w:left="144" w:right="144"/>

</xml_diff>

<commit_message>
checkpoints to permit pull
</commit_message>
<xml_diff>
--- a/CUWebinars.Web/App_Data/mergeTemplates/WeeklyInvoice1.docx
+++ b/CUWebinars.Web/App_Data/mergeTemplates/WeeklyInvoice1.docx
@@ -17,8 +17,6 @@
           <w:szCs w:val="22"/>
         </w:rPr>
       </w:pPr>
-      <w:bookmarkStart w:id="0" w:name="_GoBack"/>
-      <w:bookmarkEnd w:id="0"/>
       <w:r>
         <w:rPr>
           <w:rFonts w:eastAsia="Times New Roman" w:cs="Times New Roman"/>
@@ -557,12 +555,12 @@
         <w:tblLook w:val="04A0" w:firstRow="1" w:lastRow="0" w:firstColumn="1" w:lastColumn="0" w:noHBand="0" w:noVBand="1"/>
       </w:tblPr>
       <w:tblGrid>
-        <w:gridCol w:w="864"/>
-        <w:gridCol w:w="6422"/>
-        <w:gridCol w:w="1348"/>
-        <w:gridCol w:w="1080"/>
-        <w:gridCol w:w="1532"/>
-        <w:gridCol w:w="2429"/>
+        <w:gridCol w:w="682"/>
+        <w:gridCol w:w="5704"/>
+        <w:gridCol w:w="898"/>
+        <w:gridCol w:w="991"/>
+        <w:gridCol w:w="1079"/>
+        <w:gridCol w:w="1440"/>
       </w:tblGrid>
       <w:tr>
         <w:trPr>
@@ -591,7 +589,7 @@
         </w:tc>
         <w:tc>
           <w:tcPr>
-            <w:tcW w:w="2348" w:type="pct"/>
+            <w:tcW w:w="2642" w:type="pct"/>
             <w:shd w:val="clear" w:color="auto" w:fill="323E4F" w:themeFill="text2" w:themeFillShade="BF"/>
             <w:vAlign w:val="center"/>
           </w:tcPr>
@@ -621,7 +619,7 @@
         </w:tc>
         <w:tc>
           <w:tcPr>
-            <w:tcW w:w="493" w:type="pct"/>
+            <w:tcW w:w="416" w:type="pct"/>
             <w:shd w:val="clear" w:color="auto" w:fill="323E4F" w:themeFill="text2" w:themeFillShade="BF"/>
             <w:vAlign w:val="center"/>
           </w:tcPr>
@@ -651,7 +649,7 @@
         </w:tc>
         <w:tc>
           <w:tcPr>
-            <w:tcW w:w="395" w:type="pct"/>
+            <w:tcW w:w="459" w:type="pct"/>
             <w:shd w:val="clear" w:color="auto" w:fill="323E4F" w:themeFill="text2" w:themeFillShade="BF"/>
             <w:vAlign w:val="center"/>
           </w:tcPr>
@@ -704,7 +702,7 @@
         </w:tc>
         <w:tc>
           <w:tcPr>
-            <w:tcW w:w="560" w:type="pct"/>
+            <w:tcW w:w="500" w:type="pct"/>
             <w:shd w:val="clear" w:color="auto" w:fill="323E4F" w:themeFill="text2" w:themeFillShade="BF"/>
             <w:vAlign w:val="center"/>
           </w:tcPr>
@@ -734,7 +732,7 @@
         </w:tc>
         <w:tc>
           <w:tcPr>
-            <w:tcW w:w="888" w:type="pct"/>
+            <w:tcW w:w="667" w:type="pct"/>
             <w:shd w:val="clear" w:color="auto" w:fill="323E4F" w:themeFill="text2" w:themeFillShade="BF"/>
             <w:vAlign w:val="center"/>
           </w:tcPr>
@@ -828,7 +826,7 @@
         </w:tc>
         <w:tc>
           <w:tcPr>
-            <w:tcW w:w="2348" w:type="pct"/>
+            <w:tcW w:w="2642" w:type="pct"/>
           </w:tcPr>
           <w:p>
             <w:pPr>
@@ -1006,7 +1004,7 @@
         </w:tc>
         <w:tc>
           <w:tcPr>
-            <w:tcW w:w="493" w:type="pct"/>
+            <w:tcW w:w="416" w:type="pct"/>
             <w:vAlign w:val="center"/>
           </w:tcPr>
           <w:p>
@@ -1132,7 +1130,7 @@
         </w:tc>
         <w:tc>
           <w:tcPr>
-            <w:tcW w:w="395" w:type="pct"/>
+            <w:tcW w:w="459" w:type="pct"/>
             <w:vAlign w:val="center"/>
           </w:tcPr>
           <w:p>
@@ -1198,7 +1196,7 @@
         </w:tc>
         <w:tc>
           <w:tcPr>
-            <w:tcW w:w="560" w:type="pct"/>
+            <w:tcW w:w="500" w:type="pct"/>
             <w:vAlign w:val="center"/>
           </w:tcPr>
           <w:p>
@@ -1264,7 +1262,7 @@
         </w:tc>
         <w:tc>
           <w:tcPr>
-            <w:tcW w:w="887" w:type="pct"/>
+            <w:tcW w:w="667" w:type="pct"/>
             <w:vAlign w:val="center"/>
           </w:tcPr>
           <w:p>
@@ -1391,9 +1389,8 @@
     </w:p>
     <w:p>
       <w:pPr>
-        <w:keepLines/>
         <w:spacing w:before="0" w:after="200" w:line="276" w:lineRule="auto"/>
-        <w:ind w:left="720" w:right="0"/>
+        <w:ind w:left="0" w:right="0"/>
         <w:contextualSpacing/>
         <w:rPr>
           <w:rFonts w:eastAsia="Times New Roman" w:cs="Times New Roman"/>
@@ -1404,127 +1401,76 @@
       </w:pPr>
       <w:r>
         <w:rPr>
-          <w:rFonts w:eastAsia="Times New Roman" w:cs="Times New Roman"/>
-          <w:color w:val="auto"/>
-          <w:sz w:val="22"/>
-          <w:szCs w:val="22"/>
-        </w:rPr>
-        <w:t xml:space="preserve">Total Revenue Billed: </w:t>
-      </w:r>
-      <w:fldSimple w:instr=" MERGEFIELD  TotalOnBilled  \* MERGEFORMAT ">
-        <w:r>
-          <w:rPr>
-            <w:noProof/>
-          </w:rPr>
-          <w:t>«TotalOnBilled»</w:t>
-        </w:r>
-      </w:fldSimple>
-    </w:p>
-    <w:p>
-      <w:pPr>
-        <w:keepLines/>
-        <w:spacing w:before="0" w:after="200" w:line="276" w:lineRule="auto"/>
-        <w:ind w:left="720" w:right="0"/>
-        <w:contextualSpacing/>
-      </w:pPr>
-      <w:r>
-        <w:rPr>
-          <w:rFonts w:eastAsia="Times New Roman" w:cs="Times New Roman"/>
-          <w:color w:val="auto"/>
-          <w:sz w:val="22"/>
-          <w:szCs w:val="22"/>
-        </w:rPr>
-        <w:t>Total Revenue Paid:</w:t>
-      </w:r>
-      <w:r>
-        <w:t xml:space="preserve"> </w:t>
-      </w:r>
-      <w:fldSimple w:instr=" MERGEFIELD  TotalOnPaid  \* MERGEFORMAT ">
-        <w:r>
-          <w:rPr>
-            <w:noProof/>
-          </w:rPr>
-          <w:t>«TotalOnPaid»</w:t>
-        </w:r>
-      </w:fldSimple>
-    </w:p>
-    <w:p>
-      <w:pPr>
-        <w:keepLines/>
-        <w:spacing w:before="0" w:after="200" w:line="276" w:lineRule="auto"/>
-        <w:ind w:left="720" w:right="0"/>
-        <w:contextualSpacing/>
-      </w:pPr>
-      <w:r>
-        <w:rPr>
-          <w:rFonts w:eastAsia="Times New Roman" w:cs="Times New Roman"/>
-          <w:color w:val="auto"/>
-          <w:sz w:val="22"/>
-          <w:szCs w:val="22"/>
-        </w:rPr>
-        <w:t>Total Royalties:</w:t>
-      </w:r>
-      <w:r>
-        <w:t xml:space="preserve"> </w:t>
-      </w:r>
-      <w:r>
+          <w:color w:val="auto"/>
+        </w:rPr>
         <w:fldChar w:fldCharType="begin"/>
       </w:r>
       <w:r>
-        <w:instrText xml:space="preserve"> MERGEFIELD  TotalRoyalties  \* MERGEFORMAT </w:instrText>
-      </w:r>
-      <w:r>
+        <w:rPr>
+          <w:color w:val="auto"/>
+        </w:rPr>
+        <w:instrText xml:space="preserve"> MERGEFIELD  TotalRevenueBilledLabel \b --  \* MERGEFORMAT </w:instrText>
+      </w:r>
+      <w:r>
+        <w:rPr>
+          <w:color w:val="auto"/>
+        </w:rPr>
         <w:fldChar w:fldCharType="separate"/>
       </w:r>
       <w:r>
         <w:rPr>
           <w:noProof/>
-        </w:rPr>
-        <w:t>«TotalRoyalties»</w:t>
-      </w:r>
+          <w:color w:val="auto"/>
+        </w:rPr>
+        <w:t>--«TotalRevenueBille</w:t>
+      </w:r>
+      <w:bookmarkStart w:id="0" w:name="_GoBack"/>
+      <w:bookmarkEnd w:id="0"/>
       <w:r>
         <w:rPr>
           <w:noProof/>
+          <w:color w:val="auto"/>
+        </w:rPr>
+        <w:t>dLabel»</w:t>
+      </w:r>
+      <w:r>
+        <w:rPr>
+          <w:color w:val="auto"/>
         </w:rPr>
         <w:fldChar w:fldCharType="end"/>
       </w:r>
-    </w:p>
-    <w:p>
-      <w:pPr>
-        <w:keepLines/>
-        <w:spacing w:before="0" w:after="200" w:line="276" w:lineRule="auto"/>
-        <w:ind w:left="720" w:right="0"/>
-        <w:contextualSpacing/>
-      </w:pPr>
-      <w:r>
+      <w:r>
+        <w:rPr>
+          <w:color w:val="auto"/>
+        </w:rPr>
         <w:fldChar w:fldCharType="begin"/>
       </w:r>
       <w:r>
-        <w:instrText xml:space="preserve"> MERGEFIELD  TotalNetDueLabel  \* MERGEFORMAT </w:instrText>
-      </w:r>
-      <w:r>
+        <w:rPr>
+          <w:color w:val="auto"/>
+        </w:rPr>
+        <w:instrText xml:space="preserve"> MERGEFIELD  TotalOnBilled  \* MERGEFORMAT </w:instrText>
+      </w:r>
+      <w:r>
+        <w:rPr>
+          <w:color w:val="auto"/>
+        </w:rPr>
         <w:fldChar w:fldCharType="separate"/>
       </w:r>
       <w:r>
         <w:rPr>
           <w:noProof/>
-        </w:rPr>
-        <w:t>«TotalNetDueLabel»</w:t>
+          <w:color w:val="auto"/>
+        </w:rPr>
+        <w:t>«TotalOnBilled»</w:t>
       </w:r>
       <w:r>
         <w:rPr>
           <w:noProof/>
+          <w:color w:val="auto"/>
         </w:rPr>
         <w:fldChar w:fldCharType="end"/>
       </w:r>
-      <w:fldSimple w:instr=" MERGEFIELD  TotalNetDue  \* MERGEFORMAT ">
-        <w:r>
-          <w:rPr>
-            <w:noProof/>
-          </w:rPr>
-          <w:t>«TotalNetDue»</w:t>
-        </w:r>
-      </w:fldSimple>
     </w:p>
     <w:p>
       <w:pPr>
@@ -1532,53 +1478,69 @@
         <w:ind w:left="0" w:right="0"/>
         <w:contextualSpacing/>
         <w:rPr>
+          <w:color w:val="auto"/>
+        </w:rPr>
+      </w:pPr>
+      <w:r>
+        <w:rPr>
+          <w:color w:val="auto"/>
+        </w:rPr>
+        <w:fldChar w:fldCharType="begin"/>
+      </w:r>
+      <w:r>
+        <w:rPr>
+          <w:color w:val="auto"/>
+        </w:rPr>
+        <w:instrText xml:space="preserve"> MERGEFIELD  TotalRevenuePaidLabel  \* MERGEFORMAT </w:instrText>
+      </w:r>
+      <w:r>
+        <w:rPr>
+          <w:color w:val="auto"/>
+        </w:rPr>
+        <w:fldChar w:fldCharType="separate"/>
+      </w:r>
+      <w:r>
+        <w:rPr>
           <w:noProof/>
-          <w:color w:val="000000" w:themeColor="text1"/>
-        </w:rPr>
-      </w:pPr>
-      <w:r>
-        <w:rPr>
-          <w:rFonts w:eastAsia="Times New Roman" w:cs="Times New Roman"/>
-          <w:color w:val="auto"/>
-          <w:sz w:val="22"/>
-          <w:szCs w:val="22"/>
+          <w:color w:val="auto"/>
+        </w:rPr>
+        <w:t>«TotalRevenuePaidLabel»</w:t>
+      </w:r>
+      <w:r>
+        <w:rPr>
+          <w:color w:val="auto"/>
+        </w:rPr>
+        <w:fldChar w:fldCharType="end"/>
+      </w:r>
+      <w:r>
+        <w:rPr>
+          <w:color w:val="auto"/>
         </w:rPr>
         <w:fldChar w:fldCharType="begin"/>
       </w:r>
       <w:r>
         <w:rPr>
-          <w:rFonts w:eastAsia="Times New Roman" w:cs="Times New Roman"/>
-          <w:color w:val="auto"/>
-          <w:sz w:val="22"/>
-          <w:szCs w:val="22"/>
-        </w:rPr>
-        <w:instrText xml:space="preserve"> MERGEFIELD  RangeEnd:Webinars  \* MERGEFORMAT </w:instrText>
-      </w:r>
-      <w:r>
-        <w:rPr>
-          <w:rFonts w:eastAsia="Times New Roman" w:cs="Times New Roman"/>
-          <w:color w:val="auto"/>
-          <w:sz w:val="22"/>
-          <w:szCs w:val="22"/>
+          <w:color w:val="auto"/>
+        </w:rPr>
+        <w:instrText xml:space="preserve"> MERGEFIELD  TotalOnPaid  \* MERGEFORMAT </w:instrText>
+      </w:r>
+      <w:r>
+        <w:rPr>
+          <w:color w:val="auto"/>
         </w:rPr>
         <w:fldChar w:fldCharType="separate"/>
       </w:r>
       <w:r>
         <w:rPr>
-          <w:rFonts w:eastAsia="Times New Roman" w:cs="Times New Roman"/>
           <w:noProof/>
           <w:color w:val="auto"/>
-          <w:sz w:val="22"/>
-          <w:szCs w:val="22"/>
-        </w:rPr>
-        <w:t>«RangeEnd:Webinars»</w:t>
-      </w:r>
-      <w:r>
-        <w:rPr>
-          <w:rFonts w:eastAsia="Times New Roman" w:cs="Times New Roman"/>
-          <w:color w:val="auto"/>
-          <w:sz w:val="22"/>
-          <w:szCs w:val="22"/>
+        </w:rPr>
+        <w:t>«TotalOnPaid»</w:t>
+      </w:r>
+      <w:r>
+        <w:rPr>
+          <w:noProof/>
+          <w:color w:val="auto"/>
         </w:rPr>
         <w:fldChar w:fldCharType="end"/>
       </w:r>
@@ -1589,48 +1551,209 @@
         <w:ind w:left="0" w:right="0"/>
         <w:contextualSpacing/>
         <w:rPr>
-          <w:rFonts w:eastAsia="Times New Roman" w:cs="Times New Roman"/>
-          <w:color w:val="auto"/>
-          <w:sz w:val="22"/>
-          <w:szCs w:val="22"/>
+          <w:color w:val="auto"/>
         </w:rPr>
       </w:pPr>
       <w:r>
         <w:rPr>
-          <w:rFonts w:eastAsia="Times New Roman" w:cs="Times New Roman"/>
-          <w:color w:val="auto"/>
-          <w:sz w:val="22"/>
-          <w:szCs w:val="22"/>
+          <w:color w:val="auto"/>
         </w:rPr>
         <w:fldChar w:fldCharType="begin"/>
       </w:r>
       <w:r>
         <w:rPr>
-          <w:rFonts w:eastAsia="Times New Roman" w:cs="Times New Roman"/>
-          <w:color w:val="auto"/>
-          <w:sz w:val="22"/>
-          <w:szCs w:val="22"/>
-        </w:rPr>
-        <w:instrText xml:space="preserve"> MERGEFIELD  RangeStart:PostEventOrders  \* MERGEFORMAT </w:instrText>
-      </w:r>
-      <w:r>
-        <w:rPr>
-          <w:rFonts w:eastAsia="Times New Roman" w:cs="Times New Roman"/>
-          <w:color w:val="auto"/>
-          <w:sz w:val="22"/>
-          <w:szCs w:val="22"/>
+          <w:color w:val="auto"/>
+        </w:rPr>
+        <w:instrText xml:space="preserve"> MERGEFIELD  TotalRoyaltiesLabel  \* MERGEFORMAT </w:instrText>
+      </w:r>
+      <w:r>
+        <w:rPr>
+          <w:color w:val="auto"/>
         </w:rPr>
         <w:fldChar w:fldCharType="separate"/>
       </w:r>
       <w:r>
         <w:rPr>
-          <w:rFonts w:eastAsia="Times New Roman" w:cs="Times New Roman"/>
           <w:noProof/>
           <w:color w:val="auto"/>
-          <w:sz w:val="22"/>
-          <w:szCs w:val="22"/>
-        </w:rPr>
-        <w:t>«RangeStart:PostEventOrders»</w:t>
+        </w:rPr>
+        <w:t>«TotalRoyaltiesLabel»</w:t>
+      </w:r>
+      <w:r>
+        <w:rPr>
+          <w:color w:val="auto"/>
+        </w:rPr>
+        <w:fldChar w:fldCharType="end"/>
+      </w:r>
+      <w:r>
+        <w:rPr>
+          <w:color w:val="auto"/>
+        </w:rPr>
+        <w:fldChar w:fldCharType="begin"/>
+      </w:r>
+      <w:r>
+        <w:rPr>
+          <w:color w:val="auto"/>
+        </w:rPr>
+        <w:instrText xml:space="preserve"> MERGEFIELD  TotalRoyalties  \* MERGEFORMAT </w:instrText>
+      </w:r>
+      <w:r>
+        <w:rPr>
+          <w:color w:val="auto"/>
+        </w:rPr>
+        <w:fldChar w:fldCharType="separate"/>
+      </w:r>
+      <w:r>
+        <w:rPr>
+          <w:noProof/>
+          <w:color w:val="auto"/>
+        </w:rPr>
+        <w:t>«TotalRoyalties»</w:t>
+      </w:r>
+      <w:r>
+        <w:rPr>
+          <w:noProof/>
+          <w:color w:val="auto"/>
+        </w:rPr>
+        <w:fldChar w:fldCharType="end"/>
+      </w:r>
+    </w:p>
+    <w:p>
+      <w:pPr>
+        <w:spacing w:before="0" w:after="200" w:line="276" w:lineRule="auto"/>
+        <w:ind w:left="0" w:right="0"/>
+        <w:contextualSpacing/>
+        <w:rPr>
+          <w:color w:val="auto"/>
+        </w:rPr>
+      </w:pPr>
+      <w:r>
+        <w:rPr>
+          <w:rFonts w:eastAsia="Times New Roman" w:cs="Times New Roman"/>
+          <w:color w:val="auto"/>
+          <w:sz w:val="22"/>
+          <w:szCs w:val="22"/>
+        </w:rPr>
+        <w:fldChar w:fldCharType="begin"/>
+      </w:r>
+      <w:r>
+        <w:rPr>
+          <w:rFonts w:eastAsia="Times New Roman" w:cs="Times New Roman"/>
+          <w:color w:val="auto"/>
+          <w:sz w:val="22"/>
+          <w:szCs w:val="22"/>
+        </w:rPr>
+        <w:instrText xml:space="preserve"> MERGEFIELD  TotalNetDueLabel  \* MERGEFORMAT </w:instrText>
+      </w:r>
+      <w:r>
+        <w:rPr>
+          <w:rFonts w:eastAsia="Times New Roman" w:cs="Times New Roman"/>
+          <w:color w:val="auto"/>
+          <w:sz w:val="22"/>
+          <w:szCs w:val="22"/>
+        </w:rPr>
+        <w:fldChar w:fldCharType="separate"/>
+      </w:r>
+      <w:r>
+        <w:rPr>
+          <w:rFonts w:eastAsia="Times New Roman" w:cs="Times New Roman"/>
+          <w:noProof/>
+          <w:color w:val="auto"/>
+          <w:sz w:val="22"/>
+          <w:szCs w:val="22"/>
+        </w:rPr>
+        <w:t>«TotalNetDueLabel»</w:t>
+      </w:r>
+      <w:r>
+        <w:rPr>
+          <w:rFonts w:eastAsia="Times New Roman" w:cs="Times New Roman"/>
+          <w:color w:val="auto"/>
+          <w:sz w:val="22"/>
+          <w:szCs w:val="22"/>
+        </w:rPr>
+        <w:fldChar w:fldCharType="end"/>
+      </w:r>
+      <w:r>
+        <w:rPr>
+          <w:color w:val="auto"/>
+        </w:rPr>
+        <w:fldChar w:fldCharType="begin"/>
+      </w:r>
+      <w:r>
+        <w:rPr>
+          <w:color w:val="auto"/>
+        </w:rPr>
+        <w:instrText xml:space="preserve"> MERGEFIELD  TotalNetDue  \* MERGEFORMAT </w:instrText>
+      </w:r>
+      <w:r>
+        <w:rPr>
+          <w:color w:val="auto"/>
+        </w:rPr>
+        <w:fldChar w:fldCharType="separate"/>
+      </w:r>
+      <w:r>
+        <w:rPr>
+          <w:noProof/>
+          <w:color w:val="auto"/>
+        </w:rPr>
+        <w:t>«TotalNetDue»</w:t>
+      </w:r>
+      <w:r>
+        <w:rPr>
+          <w:noProof/>
+          <w:color w:val="auto"/>
+        </w:rPr>
+        <w:fldChar w:fldCharType="end"/>
+      </w:r>
+    </w:p>
+    <w:p>
+      <w:pPr>
+        <w:spacing w:before="0" w:after="200" w:line="276" w:lineRule="auto"/>
+        <w:ind w:left="0" w:right="0"/>
+        <w:contextualSpacing/>
+        <w:rPr>
+          <w:rFonts w:eastAsia="Times New Roman" w:cs="Times New Roman"/>
+          <w:color w:val="auto"/>
+          <w:sz w:val="22"/>
+          <w:szCs w:val="22"/>
+        </w:rPr>
+      </w:pPr>
+      <w:r>
+        <w:rPr>
+          <w:rFonts w:eastAsia="Times New Roman" w:cs="Times New Roman"/>
+          <w:color w:val="auto"/>
+          <w:sz w:val="22"/>
+          <w:szCs w:val="22"/>
+        </w:rPr>
+        <w:fldChar w:fldCharType="begin"/>
+      </w:r>
+      <w:r>
+        <w:rPr>
+          <w:rFonts w:eastAsia="Times New Roman" w:cs="Times New Roman"/>
+          <w:color w:val="auto"/>
+          <w:sz w:val="22"/>
+          <w:szCs w:val="22"/>
+        </w:rPr>
+        <w:instrText xml:space="preserve"> MERGEFIELD  RangeEnd:Webinars  \* MERGEFORMAT </w:instrText>
+      </w:r>
+      <w:r>
+        <w:rPr>
+          <w:rFonts w:eastAsia="Times New Roman" w:cs="Times New Roman"/>
+          <w:color w:val="auto"/>
+          <w:sz w:val="22"/>
+          <w:szCs w:val="22"/>
+        </w:rPr>
+        <w:fldChar w:fldCharType="separate"/>
+      </w:r>
+      <w:r>
+        <w:rPr>
+          <w:rFonts w:eastAsia="Times New Roman" w:cs="Times New Roman"/>
+          <w:noProof/>
+          <w:color w:val="auto"/>
+          <w:sz w:val="22"/>
+          <w:szCs w:val="22"/>
+        </w:rPr>
+        <w:t>«RangeEnd:Webinars»</w:t>
       </w:r>
       <w:r>
         <w:rPr>
@@ -1661,10 +1784,8 @@
         <w:ind w:left="0" w:right="0"/>
         <w:contextualSpacing/>
         <w:rPr>
-          <w:rFonts w:eastAsia="Times New Roman" w:cs="Times New Roman"/>
-          <w:color w:val="auto"/>
-          <w:sz w:val="22"/>
-          <w:szCs w:val="22"/>
+          <w:noProof/>
+          <w:color w:val="000000" w:themeColor="text1"/>
         </w:rPr>
       </w:pPr>
     </w:p>
@@ -1680,19 +1801,52 @@
           <w:szCs w:val="22"/>
         </w:rPr>
       </w:pPr>
-    </w:p>
-    <w:p>
-      <w:pPr>
-        <w:spacing w:before="0" w:after="200" w:line="276" w:lineRule="auto"/>
-        <w:ind w:left="0" w:right="0"/>
-        <w:contextualSpacing/>
-        <w:rPr>
-          <w:rFonts w:eastAsia="Times New Roman" w:cs="Times New Roman"/>
-          <w:color w:val="auto"/>
-          <w:sz w:val="22"/>
-          <w:szCs w:val="22"/>
-        </w:rPr>
-      </w:pPr>
+      <w:r>
+        <w:rPr>
+          <w:rFonts w:eastAsia="Times New Roman" w:cs="Times New Roman"/>
+          <w:color w:val="auto"/>
+          <w:sz w:val="22"/>
+          <w:szCs w:val="22"/>
+        </w:rPr>
+        <w:fldChar w:fldCharType="begin"/>
+      </w:r>
+      <w:r>
+        <w:rPr>
+          <w:rFonts w:eastAsia="Times New Roman" w:cs="Times New Roman"/>
+          <w:color w:val="auto"/>
+          <w:sz w:val="22"/>
+          <w:szCs w:val="22"/>
+        </w:rPr>
+        <w:instrText xml:space="preserve"> MERGEFIELD  RangeStart:PostEventOrders  \* MERGEFORMAT </w:instrText>
+      </w:r>
+      <w:r>
+        <w:rPr>
+          <w:rFonts w:eastAsia="Times New Roman" w:cs="Times New Roman"/>
+          <w:color w:val="auto"/>
+          <w:sz w:val="22"/>
+          <w:szCs w:val="22"/>
+        </w:rPr>
+        <w:fldChar w:fldCharType="separate"/>
+      </w:r>
+      <w:r>
+        <w:rPr>
+          <w:rFonts w:eastAsia="Times New Roman" w:cs="Times New Roman"/>
+          <w:noProof/>
+          <w:color w:val="auto"/>
+          <w:sz w:val="22"/>
+          <w:szCs w:val="22"/>
+        </w:rPr>
+        <w:t>«RangeStart:PostEventOrders»</w:t>
+      </w:r>
+      <w:r>
+        <w:rPr>
+          <w:rFonts w:eastAsia="Times New Roman" w:cs="Times New Roman"/>
+          <w:color w:val="auto"/>
+          <w:sz w:val="22"/>
+          <w:szCs w:val="22"/>
+        </w:rPr>
+        <w:fldChar w:fldCharType="end"/>
+      </w:r>
     </w:p>
     <w:p>
       <w:pPr>
@@ -1792,12 +1946,12 @@
         <w:tblLook w:val="04A0" w:firstRow="1" w:lastRow="0" w:firstColumn="1" w:lastColumn="0" w:noHBand="0" w:noVBand="1"/>
       </w:tblPr>
       <w:tblGrid>
-        <w:gridCol w:w="739"/>
-        <w:gridCol w:w="7390"/>
-        <w:gridCol w:w="1293"/>
-        <w:gridCol w:w="1293"/>
-        <w:gridCol w:w="1293"/>
-        <w:gridCol w:w="1662"/>
+        <w:gridCol w:w="582"/>
+        <w:gridCol w:w="5833"/>
+        <w:gridCol w:w="1021"/>
+        <w:gridCol w:w="1021"/>
+        <w:gridCol w:w="1021"/>
+        <w:gridCol w:w="1312"/>
       </w:tblGrid>
       <w:tr>
         <w:tc>
@@ -2013,7 +2167,14 @@
               <w:rPr>
                 <w:noProof/>
               </w:rPr>
-              <w:t>«RowNumber».</w:t>
+              <w:t>«</w:t>
+            </w:r>
+            <w:r>
+              <w:rPr>
+                <w:noProof/>
+              </w:rPr>
+              <w:lastRenderedPageBreak/>
+              <w:t>RowNumber».</w:t>
             </w:r>
             <w:r>
               <w:rPr>
@@ -2048,6 +2209,7 @@
                 <w:sz w:val="22"/>
                 <w:szCs w:val="22"/>
               </w:rPr>
+              <w:lastRenderedPageBreak/>
               <w:fldChar w:fldCharType="begin"/>
             </w:r>
             <w:r>
@@ -2701,31 +2863,64 @@
       </w:pPr>
       <w:r>
         <w:rPr>
-          <w:rFonts w:eastAsia="Times New Roman" w:cs="Times New Roman"/>
-          <w:color w:val="auto"/>
-          <w:sz w:val="22"/>
-          <w:szCs w:val="22"/>
-        </w:rPr>
-        <w:t xml:space="preserve">Total Revenue Billed: </w:t>
-      </w:r>
-      <w:r>
+          <w:color w:val="auto"/>
+        </w:rPr>
         <w:fldChar w:fldCharType="begin"/>
       </w:r>
       <w:r>
+        <w:rPr>
+          <w:color w:val="auto"/>
+        </w:rPr>
+        <w:instrText xml:space="preserve"> MERGEFIELD  TotalRevenueBilledLabel \b --  \* MERGEFORMAT </w:instrText>
+      </w:r>
+      <w:r>
+        <w:rPr>
+          <w:color w:val="auto"/>
+        </w:rPr>
+        <w:fldChar w:fldCharType="separate"/>
+      </w:r>
+      <w:r>
+        <w:rPr>
+          <w:noProof/>
+          <w:color w:val="auto"/>
+        </w:rPr>
+        <w:t>--«TotalRevenueBilledLabel»</w:t>
+      </w:r>
+      <w:r>
+        <w:rPr>
+          <w:color w:val="auto"/>
+        </w:rPr>
+        <w:fldChar w:fldCharType="end"/>
+      </w:r>
+      <w:r>
+        <w:rPr>
+          <w:color w:val="auto"/>
+        </w:rPr>
+        <w:fldChar w:fldCharType="begin"/>
+      </w:r>
+      <w:r>
+        <w:rPr>
+          <w:color w:val="auto"/>
+        </w:rPr>
         <w:instrText xml:space="preserve"> MERGEFIELD  TotalOnBilled  \* MERGEFORMAT </w:instrText>
       </w:r>
       <w:r>
+        <w:rPr>
+          <w:color w:val="auto"/>
+        </w:rPr>
         <w:fldChar w:fldCharType="separate"/>
       </w:r>
       <w:r>
         <w:rPr>
           <w:noProof/>
+          <w:color w:val="auto"/>
         </w:rPr>
         <w:t>«TotalOnBilled»</w:t>
       </w:r>
       <w:r>
         <w:rPr>
           <w:noProof/>
+          <w:color w:val="auto"/>
         </w:rPr>
         <w:fldChar w:fldCharType="end"/>
       </w:r>
@@ -2735,37 +2930,70 @@
         <w:spacing w:before="0" w:after="200" w:line="276" w:lineRule="auto"/>
         <w:ind w:left="0" w:right="0"/>
         <w:contextualSpacing/>
+        <w:rPr>
+          <w:color w:val="auto"/>
+        </w:rPr>
       </w:pPr>
       <w:r>
         <w:rPr>
-          <w:rFonts w:eastAsia="Times New Roman" w:cs="Times New Roman"/>
-          <w:color w:val="auto"/>
-          <w:sz w:val="22"/>
-          <w:szCs w:val="22"/>
-        </w:rPr>
-        <w:t>Total Revenue Paid:</w:t>
-      </w:r>
-      <w:r>
-        <w:t xml:space="preserve"> </w:t>
-      </w:r>
-      <w:r>
+          <w:color w:val="auto"/>
+        </w:rPr>
         <w:fldChar w:fldCharType="begin"/>
       </w:r>
       <w:r>
+        <w:rPr>
+          <w:color w:val="auto"/>
+        </w:rPr>
+        <w:instrText xml:space="preserve"> MERGEFIELD  TotalRevenuePaidLabel  \* MERGEFORMAT </w:instrText>
+      </w:r>
+      <w:r>
+        <w:rPr>
+          <w:color w:val="auto"/>
+        </w:rPr>
+        <w:fldChar w:fldCharType="separate"/>
+      </w:r>
+      <w:r>
+        <w:rPr>
+          <w:noProof/>
+          <w:color w:val="auto"/>
+        </w:rPr>
+        <w:t>«TotalRevenuePaidLabel»</w:t>
+      </w:r>
+      <w:r>
+        <w:rPr>
+          <w:color w:val="auto"/>
+        </w:rPr>
+        <w:fldChar w:fldCharType="end"/>
+      </w:r>
+      <w:r>
+        <w:rPr>
+          <w:color w:val="auto"/>
+        </w:rPr>
+        <w:fldChar w:fldCharType="begin"/>
+      </w:r>
+      <w:r>
+        <w:rPr>
+          <w:color w:val="auto"/>
+        </w:rPr>
         <w:instrText xml:space="preserve"> MERGEFIELD  TotalOnPaid  \* MERGEFORMAT </w:instrText>
       </w:r>
       <w:r>
+        <w:rPr>
+          <w:color w:val="auto"/>
+        </w:rPr>
         <w:fldChar w:fldCharType="separate"/>
       </w:r>
       <w:r>
         <w:rPr>
           <w:noProof/>
+          <w:color w:val="auto"/>
         </w:rPr>
         <w:t>«TotalOnPaid»</w:t>
       </w:r>
       <w:r>
         <w:rPr>
           <w:noProof/>
+          <w:color w:val="auto"/>
         </w:rPr>
         <w:fldChar w:fldCharType="end"/>
       </w:r>
@@ -2775,37 +3003,70 @@
         <w:spacing w:before="0" w:after="200" w:line="276" w:lineRule="auto"/>
         <w:ind w:left="0" w:right="0"/>
         <w:contextualSpacing/>
+        <w:rPr>
+          <w:color w:val="auto"/>
+        </w:rPr>
       </w:pPr>
       <w:r>
         <w:rPr>
-          <w:rFonts w:eastAsia="Times New Roman" w:cs="Times New Roman"/>
-          <w:color w:val="auto"/>
-          <w:sz w:val="22"/>
-          <w:szCs w:val="22"/>
-        </w:rPr>
-        <w:t>Total Royalties:</w:t>
-      </w:r>
-      <w:r>
-        <w:t xml:space="preserve"> </w:t>
-      </w:r>
-      <w:r>
+          <w:color w:val="auto"/>
+        </w:rPr>
         <w:fldChar w:fldCharType="begin"/>
       </w:r>
       <w:r>
+        <w:rPr>
+          <w:color w:val="auto"/>
+        </w:rPr>
+        <w:instrText xml:space="preserve"> MERGEFIELD  TotalRoyaltiesLabel  \* MERGEFORMAT </w:instrText>
+      </w:r>
+      <w:r>
+        <w:rPr>
+          <w:color w:val="auto"/>
+        </w:rPr>
+        <w:fldChar w:fldCharType="separate"/>
+      </w:r>
+      <w:r>
+        <w:rPr>
+          <w:noProof/>
+          <w:color w:val="auto"/>
+        </w:rPr>
+        <w:t>«TotalRoyaltiesLabel»</w:t>
+      </w:r>
+      <w:r>
+        <w:rPr>
+          <w:color w:val="auto"/>
+        </w:rPr>
+        <w:fldChar w:fldCharType="end"/>
+      </w:r>
+      <w:r>
+        <w:rPr>
+          <w:color w:val="auto"/>
+        </w:rPr>
+        <w:fldChar w:fldCharType="begin"/>
+      </w:r>
+      <w:r>
+        <w:rPr>
+          <w:color w:val="auto"/>
+        </w:rPr>
         <w:instrText xml:space="preserve"> MERGEFIELD  TotalRoyalties  \* MERGEFORMAT </w:instrText>
       </w:r>
       <w:r>
+        <w:rPr>
+          <w:color w:val="auto"/>
+        </w:rPr>
         <w:fldChar w:fldCharType="separate"/>
       </w:r>
       <w:r>
         <w:rPr>
           <w:noProof/>
+          <w:color w:val="auto"/>
         </w:rPr>
         <w:t>«TotalRoyalties»</w:t>
       </w:r>
       <w:r>
         <w:rPr>
           <w:noProof/>
+          <w:color w:val="auto"/>
         </w:rPr>
         <w:fldChar w:fldCharType="end"/>
       </w:r>
@@ -2815,6 +3076,9 @@
         <w:spacing w:before="0" w:after="200" w:line="276" w:lineRule="auto"/>
         <w:ind w:left="0" w:right="0"/>
         <w:contextualSpacing/>
+        <w:rPr>
+          <w:color w:val="auto"/>
+        </w:rPr>
       </w:pPr>
       <w:r>
         <w:rPr>
@@ -2863,23 +3127,34 @@
         <w:fldChar w:fldCharType="end"/>
       </w:r>
       <w:r>
+        <w:rPr>
+          <w:color w:val="auto"/>
+        </w:rPr>
         <w:fldChar w:fldCharType="begin"/>
       </w:r>
       <w:r>
+        <w:rPr>
+          <w:color w:val="auto"/>
+        </w:rPr>
         <w:instrText xml:space="preserve"> MERGEFIELD  TotalNetDue  \* MERGEFORMAT </w:instrText>
       </w:r>
       <w:r>
+        <w:rPr>
+          <w:color w:val="auto"/>
+        </w:rPr>
         <w:fldChar w:fldCharType="separate"/>
       </w:r>
       <w:r>
         <w:rPr>
           <w:noProof/>
+          <w:color w:val="auto"/>
         </w:rPr>
         <w:t>«TotalNetDue»</w:t>
       </w:r>
       <w:r>
         <w:rPr>
           <w:noProof/>
+          <w:color w:val="auto"/>
         </w:rPr>
         <w:fldChar w:fldCharType="end"/>
       </w:r>
@@ -2996,13 +3271,13 @@
               <wp:anchor distT="45720" distB="45720" distL="114300" distR="114300" simplePos="0" relativeHeight="251659264" behindDoc="0" locked="0" layoutInCell="1" allowOverlap="1" wp14:anchorId="0F71E9B7" wp14:editId="201FCE53">
                 <wp:simplePos x="0" y="0"/>
                 <wp:positionH relativeFrom="margin">
-                  <wp:posOffset>4589194</wp:posOffset>
+                  <wp:posOffset>4000500</wp:posOffset>
                 </wp:positionH>
                 <wp:positionV relativeFrom="paragraph">
-                  <wp:posOffset>161144</wp:posOffset>
+                  <wp:posOffset>162560</wp:posOffset>
                 </wp:positionV>
-                <wp:extent cx="4582795" cy="1404620"/>
-                <wp:effectExtent l="0" t="0" r="8255" b="7620"/>
+                <wp:extent cx="3310255" cy="1404620"/>
+                <wp:effectExtent l="0" t="0" r="4445" b="7620"/>
                 <wp:wrapSquare wrapText="bothSides"/>
                 <wp:docPr id="217" name="Text Box 2"/>
                 <wp:cNvGraphicFramePr>
@@ -3017,7 +3292,7 @@
                       <wps:spPr bwMode="auto">
                         <a:xfrm>
                           <a:off x="0" y="0"/>
-                          <a:ext cx="4582795" cy="1404620"/>
+                          <a:ext cx="3310255" cy="1404620"/>
                         </a:xfrm>
                         <a:prstGeom prst="rect">
                           <a:avLst/>
@@ -3108,7 +3383,7 @@
                 <v:stroke joinstyle="miter"/>
                 <v:path gradientshapeok="t" o:connecttype="rect"/>
               </v:shapetype>
-              <v:shape id="Text Box 2" o:spid="_x0000_s1026" type="#_x0000_t202" style="position:absolute;margin-left:361.35pt;margin-top:12.7pt;width:360.85pt;height:110.6pt;z-index:251659264;visibility:visible;mso-wrap-style:square;mso-width-percent:0;mso-height-percent:0;mso-wrap-distance-left:9pt;mso-wrap-distance-top:3.6pt;mso-wrap-distance-right:9pt;mso-wrap-distance-bottom:3.6pt;mso-position-horizontal:absolute;mso-position-horizontal-relative:margin;mso-position-vertical:absolute;mso-position-vertical-relative:text;mso-width-percent:0;mso-height-percent:0;mso-width-relative:margin;mso-height-relative:margin;v-text-anchor:top" o:gfxdata="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" stroked="f">
+              <v:shape id="Text Box 2" o:spid="_x0000_s1026" type="#_x0000_t202" style="position:absolute;margin-left:315pt;margin-top:12.8pt;width:260.65pt;height:110.6pt;z-index:251659264;visibility:visible;mso-wrap-style:square;mso-width-percent:0;mso-height-percent:0;mso-wrap-distance-left:9pt;mso-wrap-distance-top:3.6pt;mso-wrap-distance-right:9pt;mso-wrap-distance-bottom:3.6pt;mso-position-horizontal:absolute;mso-position-horizontal-relative:margin;mso-position-vertical:absolute;mso-position-vertical-relative:text;mso-width-percent:0;mso-height-percent:0;mso-width-relative:margin;mso-height-relative:margin;v-text-anchor:top" o:gfxdata="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" stroked="f">
                 <v:textbox style="mso-fit-shape-to-text:t">
                   <w:txbxContent>
                     <w:p>
@@ -3274,16 +3549,25 @@
         <w:contextualSpacing/>
       </w:pPr>
       <w:r>
-        <w:rPr>
-          <w:rFonts w:eastAsia="Times New Roman" w:cs="Times New Roman"/>
-          <w:color w:val="auto"/>
-          <w:sz w:val="22"/>
-          <w:szCs w:val="22"/>
-        </w:rPr>
-        <w:t>Grand Total Net Due:</w:t>
-      </w:r>
-      <w:r>
-        <w:t xml:space="preserve"> </w:t>
+        <w:fldChar w:fldCharType="begin"/>
+      </w:r>
+      <w:r>
+        <w:instrText xml:space="preserve"> MERGEFIELD  GrandTotalNetDueLabel  \* MERGEFORMAT </w:instrText>
+      </w:r>
+      <w:r>
+        <w:fldChar w:fldCharType="separate"/>
+      </w:r>
+      <w:r>
+        <w:rPr>
+          <w:noProof/>
+        </w:rPr>
+        <w:t>«GrandTotalNetDueLabel»</w:t>
+      </w:r>
+      <w:r>
+        <w:rPr>
+          <w:noProof/>
+        </w:rPr>
+        <w:fldChar w:fldCharType="end"/>
       </w:r>
       <w:fldSimple w:instr=" MERGEFIELD  GrandTotalNetDue  \* MERGEFORMAT ">
         <w:r>
@@ -3303,8 +3587,8 @@
       </w:pPr>
     </w:p>
     <w:sectPr>
-      <w:pgSz w:w="15840" w:h="12240" w:orient="landscape"/>
-      <w:pgMar w:top="1440" w:right="1080" w:bottom="1440" w:left="1080" w:header="720" w:footer="720" w:gutter="0"/>
+      <w:pgSz w:w="12240" w:h="15840"/>
+      <w:pgMar w:top="720" w:right="720" w:bottom="720" w:left="720" w:header="720" w:footer="720" w:gutter="0"/>
       <w:cols w:space="720"/>
       <w:docGrid w:linePitch="360"/>
     </w:sectPr>

</xml_diff>

<commit_message>
Checkpoints to pull latest commits
</commit_message>
<xml_diff>
--- a/CUWebinars.Web/App_Data/mergeTemplates/WeeklyInvoice1.docx
+++ b/CUWebinars.Web/App_Data/mergeTemplates/WeeklyInvoice1.docx
@@ -1897,6 +1897,15 @@
           <w:sz w:val="22"/>
           <w:szCs w:val="22"/>
         </w:rPr>
+        <w:t xml:space="preserve">These </w:t>
+      </w:r>
+      <w:r>
+        <w:rPr>
+          <w:rFonts w:eastAsia="Times New Roman" w:cs="Times New Roman"/>
+          <w:color w:val="auto"/>
+          <w:sz w:val="22"/>
+          <w:szCs w:val="22"/>
+        </w:rPr>
         <w:t>orders that arrived following the event’s start)</w:t>
       </w:r>
     </w:p>
@@ -2099,36 +2108,23 @@
             <w:pPr>
               <w:jc w:val="right"/>
             </w:pPr>
-            <w:r>
-              <w:fldChar w:fldCharType="begin"/>
-            </w:r>
-            <w:r>
-              <w:instrText xml:space="preserve"> MERGEFIELD  RangeStart:pOrders  \* MERGEFORMAT </w:instrText>
-            </w:r>
-            <w:r>
-              <w:fldChar w:fldCharType="separate"/>
-            </w:r>
-            <w:r>
-              <w:rPr>
-                <w:noProof/>
-              </w:rPr>
-              <w:t>«</w:t>
-            </w:r>
-            <w:r>
-              <w:t>RangeStart</w:t>
-            </w:r>
-            <w:r>
-              <w:rPr>
-                <w:noProof/>
-              </w:rPr>
-              <w:t>:pOrders»</w:t>
-            </w:r>
-            <w:r>
-              <w:rPr>
-                <w:noProof/>
-              </w:rPr>
-              <w:fldChar w:fldCharType="end"/>
-            </w:r>
+            <w:fldSimple w:instr=" MERGEFIELD  RangeStart:pOrders  \* MERGEFORMAT ">
+              <w:r>
+                <w:rPr>
+                  <w:noProof/>
+                </w:rPr>
+                <w:t>«</w:t>
+              </w:r>
+              <w:r>
+                <w:t>RangeStart</w:t>
+              </w:r>
+              <w:r>
+                <w:rPr>
+                  <w:noProof/>
+                </w:rPr>
+                <w:t>:pOrders»</w:t>
+              </w:r>
+            </w:fldSimple>
             <w:fldSimple w:instr=" MERGEFIELD  RowNumber \f .  \* MERGEFORMAT ">
               <w:r>
                 <w:rPr>
@@ -3179,8 +3175,6 @@
         </w:rPr>
         <w:fldChar w:fldCharType="end"/>
       </w:r>
-      <w:bookmarkStart w:id="0" w:name="_GoBack"/>
-      <w:bookmarkEnd w:id="0"/>
     </w:p>
     <w:p>
       <w:pPr>
@@ -3193,9 +3187,9 @@
         </w:rPr>
       </w:pPr>
     </w:p>
-    <w:bookmarkStart w:id="1" w:name="OLE_LINK1"/>
-    <w:bookmarkStart w:id="2" w:name="OLE_LINK2"/>
-    <w:bookmarkStart w:id="3" w:name="OLE_LINK3"/>
+    <w:bookmarkStart w:id="0" w:name="OLE_LINK1"/>
+    <w:bookmarkStart w:id="1" w:name="OLE_LINK2"/>
+    <w:bookmarkStart w:id="2" w:name="OLE_LINK3"/>
     <w:p>
       <w:pPr>
         <w:spacing w:before="0" w:after="200" w:line="276" w:lineRule="auto"/>
@@ -3309,7 +3303,16 @@
           <w:sz w:val="22"/>
           <w:szCs w:val="22"/>
         </w:rPr>
-        <w:t xml:space="preserve">orders that </w:t>
+        <w:t xml:space="preserve">These </w:t>
+      </w:r>
+      <w:r>
+        <w:rPr>
+          <w:rFonts w:eastAsia="Times New Roman" w:cs="Times New Roman"/>
+          <w:color w:val="auto"/>
+          <w:sz w:val="22"/>
+          <w:szCs w:val="22"/>
+        </w:rPr>
+        <w:t xml:space="preserve">orders </w:t>
       </w:r>
       <w:r>
         <w:rPr>
@@ -3319,6 +3322,15 @@
           <w:szCs w:val="22"/>
         </w:rPr>
         <w:t>have upgraded or otherwise adjusted</w:t>
+      </w:r>
+      <w:r>
+        <w:rPr>
+          <w:rFonts w:eastAsia="Times New Roman" w:cs="Times New Roman"/>
+          <w:color w:val="auto"/>
+          <w:sz w:val="22"/>
+          <w:szCs w:val="22"/>
+        </w:rPr>
+        <w:t xml:space="preserve"> since the original invoice</w:t>
       </w:r>
       <w:r>
         <w:rPr>
@@ -3333,22 +3345,21 @@
     <w:tbl>
       <w:tblPr>
         <w:tblStyle w:val="TableGrid"/>
-        <w:tblW w:w="5000" w:type="pct"/>
+        <w:tblW w:w="4961" w:type="pct"/>
         <w:tblLayout w:type="fixed"/>
         <w:tblLook w:val="04A0" w:firstRow="1" w:lastRow="0" w:firstColumn="1" w:lastColumn="0" w:noHBand="0" w:noVBand="1"/>
       </w:tblPr>
       <w:tblGrid>
-        <w:gridCol w:w="534"/>
-        <w:gridCol w:w="5881"/>
-        <w:gridCol w:w="1021"/>
-        <w:gridCol w:w="1021"/>
-        <w:gridCol w:w="1021"/>
-        <w:gridCol w:w="1312"/>
+        <w:gridCol w:w="533"/>
+        <w:gridCol w:w="4411"/>
+        <w:gridCol w:w="1441"/>
+        <w:gridCol w:w="1441"/>
+        <w:gridCol w:w="2880"/>
       </w:tblGrid>
       <w:tr>
         <w:tc>
           <w:tcPr>
-            <w:tcW w:w="248" w:type="pct"/>
+            <w:tcW w:w="249" w:type="pct"/>
             <w:shd w:val="clear" w:color="auto" w:fill="323E4F" w:themeFill="text2" w:themeFillShade="BF"/>
             <w:vAlign w:val="center"/>
           </w:tcPr>
@@ -3369,7 +3380,7 @@
         </w:tc>
         <w:tc>
           <w:tcPr>
-            <w:tcW w:w="2725" w:type="pct"/>
+            <w:tcW w:w="2060" w:type="pct"/>
             <w:shd w:val="clear" w:color="auto" w:fill="323E4F" w:themeFill="text2" w:themeFillShade="BF"/>
             <w:vAlign w:val="center"/>
           </w:tcPr>
@@ -3399,7 +3410,7 @@
         </w:tc>
         <w:tc>
           <w:tcPr>
-            <w:tcW w:w="473" w:type="pct"/>
+            <w:tcW w:w="673" w:type="pct"/>
             <w:shd w:val="clear" w:color="auto" w:fill="323E4F" w:themeFill="text2" w:themeFillShade="BF"/>
             <w:vAlign w:val="center"/>
           </w:tcPr>
@@ -3423,13 +3434,13 @@
                 <w:sz w:val="22"/>
                 <w:szCs w:val="22"/>
               </w:rPr>
-              <w:t>Price</w:t>
+              <w:t>Adjusted Price</w:t>
             </w:r>
           </w:p>
         </w:tc>
         <w:tc>
           <w:tcPr>
-            <w:tcW w:w="473" w:type="pct"/>
+            <w:tcW w:w="673" w:type="pct"/>
             <w:shd w:val="clear" w:color="auto" w:fill="323E4F" w:themeFill="text2" w:themeFillShade="BF"/>
             <w:vAlign w:val="center"/>
           </w:tcPr>
@@ -3453,13 +3464,13 @@
                 <w:sz w:val="22"/>
                 <w:szCs w:val="22"/>
               </w:rPr>
-              <w:t>Percent</w:t>
+              <w:t>Adjusted Royalty</w:t>
             </w:r>
           </w:p>
         </w:tc>
         <w:tc>
           <w:tcPr>
-            <w:tcW w:w="473" w:type="pct"/>
+            <w:tcW w:w="1346" w:type="pct"/>
             <w:shd w:val="clear" w:color="auto" w:fill="323E4F" w:themeFill="text2" w:themeFillShade="BF"/>
             <w:vAlign w:val="center"/>
           </w:tcPr>
@@ -3483,14 +3494,337 @@
                 <w:sz w:val="22"/>
                 <w:szCs w:val="22"/>
               </w:rPr>
-              <w:t>Royalty</w:t>
+              <w:t>Notes</w:t>
+            </w:r>
+          </w:p>
+        </w:tc>
+      </w:tr>
+      <w:tr>
+        <w:tc>
+          <w:tcPr>
+            <w:tcW w:w="249" w:type="pct"/>
+          </w:tcPr>
+          <w:p>
+            <w:pPr>
+              <w:jc w:val="right"/>
+            </w:pPr>
+            <w:r>
+              <w:fldChar w:fldCharType="begin"/>
+            </w:r>
+            <w:r>
+              <w:instrText xml:space="preserve"> MERGEFIELD  RangeStart:uOrders  \* MERGEFORMAT </w:instrText>
+            </w:r>
+            <w:r>
+              <w:fldChar w:fldCharType="separate"/>
+            </w:r>
+            <w:r>
+              <w:rPr>
+                <w:noProof/>
+              </w:rPr>
+              <w:t>«RangeStart:uOrders»</w:t>
+            </w:r>
+            <w:r>
+              <w:rPr>
+                <w:noProof/>
+              </w:rPr>
+              <w:fldChar w:fldCharType="end"/>
+            </w:r>
+            <w:r>
+              <w:fldChar w:fldCharType="begin"/>
+            </w:r>
+            <w:r>
+              <w:instrText xml:space="preserve"> MERGEFIELD  RowNumber \f .  \* MERGEFORMAT </w:instrText>
+            </w:r>
+            <w:r>
+              <w:fldChar w:fldCharType="separate"/>
+            </w:r>
+            <w:r>
+              <w:rPr>
+                <w:noProof/>
+              </w:rPr>
+              <w:t>«RowNumber».</w:t>
+            </w:r>
+            <w:r>
+              <w:rPr>
+                <w:noProof/>
+              </w:rPr>
+              <w:fldChar w:fldCharType="end"/>
             </w:r>
           </w:p>
         </w:tc>
         <w:tc>
           <w:tcPr>
-            <w:tcW w:w="608" w:type="pct"/>
-            <w:shd w:val="clear" w:color="auto" w:fill="323E4F" w:themeFill="text2" w:themeFillShade="BF"/>
+            <w:tcW w:w="2060" w:type="pct"/>
+          </w:tcPr>
+          <w:p>
+            <w:pPr>
+              <w:spacing w:before="0" w:after="200" w:line="276" w:lineRule="auto"/>
+              <w:ind w:left="0" w:right="0"/>
+              <w:contextualSpacing/>
+              <w:rPr>
+                <w:rFonts w:eastAsia="Times New Roman" w:cs="Times New Roman"/>
+                <w:b/>
+                <w:color w:val="auto"/>
+                <w:sz w:val="22"/>
+                <w:szCs w:val="22"/>
+              </w:rPr>
+            </w:pPr>
+            <w:r>
+              <w:rPr>
+                <w:rFonts w:eastAsia="Times New Roman" w:cs="Times New Roman"/>
+                <w:b/>
+                <w:color w:val="auto"/>
+                <w:sz w:val="22"/>
+                <w:szCs w:val="22"/>
+              </w:rPr>
+              <w:fldChar w:fldCharType="begin"/>
+            </w:r>
+            <w:r>
+              <w:rPr>
+                <w:rFonts w:eastAsia="Times New Roman" w:cs="Times New Roman"/>
+                <w:b/>
+                <w:color w:val="auto"/>
+                <w:sz w:val="22"/>
+                <w:szCs w:val="22"/>
+              </w:rPr>
+              <w:instrText xml:space="preserve"> MERGEFIELD  WebinarTitle  \* MERGEFORMAT </w:instrText>
+            </w:r>
+            <w:r>
+              <w:rPr>
+                <w:rFonts w:eastAsia="Times New Roman" w:cs="Times New Roman"/>
+                <w:b/>
+                <w:color w:val="auto"/>
+                <w:sz w:val="22"/>
+                <w:szCs w:val="22"/>
+              </w:rPr>
+              <w:fldChar w:fldCharType="separate"/>
+            </w:r>
+            <w:r>
+              <w:rPr>
+                <w:rFonts w:eastAsia="Times New Roman" w:cs="Times New Roman"/>
+                <w:b/>
+                <w:noProof/>
+                <w:color w:val="auto"/>
+                <w:sz w:val="22"/>
+                <w:szCs w:val="22"/>
+              </w:rPr>
+              <w:t>«WebinarTitle»</w:t>
+            </w:r>
+            <w:r>
+              <w:rPr>
+                <w:rFonts w:eastAsia="Times New Roman" w:cs="Times New Roman"/>
+                <w:b/>
+                <w:color w:val="auto"/>
+                <w:sz w:val="22"/>
+                <w:szCs w:val="22"/>
+              </w:rPr>
+              <w:fldChar w:fldCharType="end"/>
+            </w:r>
+          </w:p>
+          <w:p>
+            <w:pPr>
+              <w:spacing w:before="0" w:after="200" w:line="276" w:lineRule="auto"/>
+              <w:ind w:left="0" w:right="0"/>
+              <w:contextualSpacing/>
+              <w:rPr>
+                <w:rFonts w:eastAsia="Times New Roman" w:cs="Times New Roman"/>
+                <w:color w:val="auto"/>
+                <w:sz w:val="22"/>
+                <w:szCs w:val="22"/>
+              </w:rPr>
+            </w:pPr>
+            <w:r>
+              <w:rPr>
+                <w:rFonts w:eastAsia="Times New Roman" w:cs="Times New Roman"/>
+                <w:color w:val="auto"/>
+                <w:sz w:val="22"/>
+                <w:szCs w:val="22"/>
+              </w:rPr>
+              <w:fldChar w:fldCharType="begin"/>
+            </w:r>
+            <w:r>
+              <w:rPr>
+                <w:rFonts w:eastAsia="Times New Roman" w:cs="Times New Roman"/>
+                <w:color w:val="auto"/>
+                <w:sz w:val="22"/>
+                <w:szCs w:val="22"/>
+              </w:rPr>
+              <w:instrText xml:space="preserve"> MERGEFIELD  Name  \* MERGEFORMAT </w:instrText>
+            </w:r>
+            <w:r>
+              <w:rPr>
+                <w:rFonts w:eastAsia="Times New Roman" w:cs="Times New Roman"/>
+                <w:color w:val="auto"/>
+                <w:sz w:val="22"/>
+                <w:szCs w:val="22"/>
+              </w:rPr>
+              <w:fldChar w:fldCharType="separate"/>
+            </w:r>
+            <w:r>
+              <w:rPr>
+                <w:rFonts w:eastAsia="Times New Roman" w:cs="Times New Roman"/>
+                <w:noProof/>
+                <w:color w:val="auto"/>
+                <w:sz w:val="22"/>
+                <w:szCs w:val="22"/>
+              </w:rPr>
+              <w:t>«Name»</w:t>
+            </w:r>
+            <w:r>
+              <w:rPr>
+                <w:rFonts w:eastAsia="Times New Roman" w:cs="Times New Roman"/>
+                <w:color w:val="auto"/>
+                <w:sz w:val="22"/>
+                <w:szCs w:val="22"/>
+              </w:rPr>
+              <w:fldChar w:fldCharType="end"/>
+            </w:r>
+            <w:r>
+              <w:rPr>
+                <w:rFonts w:eastAsia="Times New Roman" w:cs="Times New Roman"/>
+                <w:color w:val="auto"/>
+                <w:sz w:val="22"/>
+                <w:szCs w:val="22"/>
+              </w:rPr>
+              <w:t xml:space="preserve"> - </w:t>
+            </w:r>
+            <w:r>
+              <w:rPr>
+                <w:rFonts w:eastAsia="Times New Roman" w:cs="Times New Roman"/>
+                <w:color w:val="auto"/>
+                <w:sz w:val="22"/>
+                <w:szCs w:val="22"/>
+              </w:rPr>
+              <w:fldChar w:fldCharType="begin"/>
+            </w:r>
+            <w:r>
+              <w:rPr>
+                <w:rFonts w:eastAsia="Times New Roman" w:cs="Times New Roman"/>
+                <w:color w:val="auto"/>
+                <w:sz w:val="22"/>
+                <w:szCs w:val="22"/>
+              </w:rPr>
+              <w:instrText xml:space="preserve"> MERGEFIELD  Email  \* MERGEFORMAT </w:instrText>
+            </w:r>
+            <w:r>
+              <w:rPr>
+                <w:rFonts w:eastAsia="Times New Roman" w:cs="Times New Roman"/>
+                <w:color w:val="auto"/>
+                <w:sz w:val="22"/>
+                <w:szCs w:val="22"/>
+              </w:rPr>
+              <w:fldChar w:fldCharType="separate"/>
+            </w:r>
+            <w:r>
+              <w:rPr>
+                <w:rFonts w:eastAsia="Times New Roman" w:cs="Times New Roman"/>
+                <w:noProof/>
+                <w:color w:val="auto"/>
+                <w:sz w:val="22"/>
+                <w:szCs w:val="22"/>
+              </w:rPr>
+              <w:t>«Email»</w:t>
+            </w:r>
+            <w:r>
+              <w:rPr>
+                <w:rFonts w:eastAsia="Times New Roman" w:cs="Times New Roman"/>
+                <w:color w:val="auto"/>
+                <w:sz w:val="22"/>
+                <w:szCs w:val="22"/>
+              </w:rPr>
+              <w:fldChar w:fldCharType="end"/>
+            </w:r>
+            <w:r>
+              <w:rPr>
+                <w:rFonts w:eastAsia="Times New Roman" w:cs="Times New Roman"/>
+                <w:color w:val="auto"/>
+                <w:sz w:val="22"/>
+                <w:szCs w:val="22"/>
+              </w:rPr>
+              <w:fldChar w:fldCharType="begin"/>
+            </w:r>
+            <w:r>
+              <w:rPr>
+                <w:rFonts w:eastAsia="Times New Roman" w:cs="Times New Roman"/>
+                <w:color w:val="auto"/>
+                <w:sz w:val="22"/>
+                <w:szCs w:val="22"/>
+              </w:rPr>
+              <w:instrText xml:space="preserve"> MERGEFIELD  Institution  \* MERGEFORMAT </w:instrText>
+            </w:r>
+            <w:r>
+              <w:rPr>
+                <w:rFonts w:eastAsia="Times New Roman" w:cs="Times New Roman"/>
+                <w:color w:val="auto"/>
+                <w:sz w:val="22"/>
+                <w:szCs w:val="22"/>
+              </w:rPr>
+              <w:fldChar w:fldCharType="end"/>
+            </w:r>
+          </w:p>
+          <w:p>
+            <w:pPr>
+              <w:spacing w:before="0" w:after="200" w:line="276" w:lineRule="auto"/>
+              <w:ind w:left="0" w:right="0"/>
+              <w:contextualSpacing/>
+              <w:rPr>
+                <w:rFonts w:eastAsia="Times New Roman" w:cs="Times New Roman"/>
+                <w:color w:val="auto"/>
+                <w:sz w:val="22"/>
+                <w:szCs w:val="22"/>
+              </w:rPr>
+            </w:pPr>
+            <w:r>
+              <w:rPr>
+                <w:rFonts w:eastAsia="Times New Roman" w:cs="Times New Roman"/>
+                <w:color w:val="auto"/>
+                <w:sz w:val="22"/>
+                <w:szCs w:val="22"/>
+              </w:rPr>
+              <w:fldChar w:fldCharType="begin"/>
+            </w:r>
+            <w:r>
+              <w:rPr>
+                <w:rFonts w:eastAsia="Times New Roman" w:cs="Times New Roman"/>
+                <w:color w:val="auto"/>
+                <w:sz w:val="22"/>
+                <w:szCs w:val="22"/>
+              </w:rPr>
+              <w:instrText xml:space="preserve"> MERGEFIELD  Address  \* MERGEFORMAT </w:instrText>
+            </w:r>
+            <w:r>
+              <w:rPr>
+                <w:rFonts w:eastAsia="Times New Roman" w:cs="Times New Roman"/>
+                <w:color w:val="auto"/>
+                <w:sz w:val="22"/>
+                <w:szCs w:val="22"/>
+              </w:rPr>
+              <w:fldChar w:fldCharType="separate"/>
+            </w:r>
+            <w:r>
+              <w:rPr>
+                <w:rFonts w:eastAsia="Times New Roman" w:cs="Times New Roman"/>
+                <w:noProof/>
+                <w:color w:val="auto"/>
+                <w:sz w:val="22"/>
+                <w:szCs w:val="22"/>
+              </w:rPr>
+              <w:t>«Address»</w:t>
+            </w:r>
+            <w:r>
+              <w:rPr>
+                <w:rFonts w:eastAsia="Times New Roman" w:cs="Times New Roman"/>
+                <w:color w:val="auto"/>
+                <w:sz w:val="22"/>
+                <w:szCs w:val="22"/>
+              </w:rPr>
+              <w:fldChar w:fldCharType="end"/>
+            </w:r>
+          </w:p>
+        </w:tc>
+        <w:tc>
+          <w:tcPr>
+            <w:tcW w:w="673" w:type="pct"/>
             <w:vAlign w:val="center"/>
           </w:tcPr>
           <w:p>
@@ -3506,55 +3840,49 @@
                 <w:szCs w:val="22"/>
               </w:rPr>
             </w:pPr>
-            <w:proofErr w:type="spellStart"/>
-            <w:r>
-              <w:rPr>
-                <w:rFonts w:eastAsia="Times New Roman" w:cs="Times New Roman"/>
-                <w:color w:val="auto"/>
-                <w:sz w:val="22"/>
-                <w:szCs w:val="22"/>
-              </w:rPr>
-              <w:t>OrderID</w:t>
-            </w:r>
-            <w:proofErr w:type="spellEnd"/>
-          </w:p>
-        </w:tc>
-      </w:tr>
-      <w:tr>
-        <w:tc>
-          <w:tcPr>
-            <w:tcW w:w="248" w:type="pct"/>
-          </w:tcPr>
-          <w:p>
-            <w:pPr>
-              <w:jc w:val="right"/>
-            </w:pPr>
-            <w:fldSimple w:instr=" MERGEFIELD  RangeStart:uOrders  \* MERGEFORMAT ">
-              <w:r>
-                <w:rPr>
-                  <w:noProof/>
-                </w:rPr>
-                <w:t>«RangeStart:uOrders»</w:t>
-              </w:r>
-            </w:fldSimple>
-            <w:r>
+            <w:r>
+              <w:rPr>
+                <w:rFonts w:eastAsia="Times New Roman" w:cs="Times New Roman"/>
+                <w:color w:val="auto"/>
+                <w:sz w:val="22"/>
+                <w:szCs w:val="22"/>
+              </w:rPr>
               <w:fldChar w:fldCharType="begin"/>
             </w:r>
             <w:r>
-              <w:instrText xml:space="preserve"> MERGEFIELD  RowNumber \f .  \* MERGEFORMAT </w:instrText>
-            </w:r>
-            <w:r>
+              <w:rPr>
+                <w:rFonts w:eastAsia="Times New Roman" w:cs="Times New Roman"/>
+                <w:color w:val="auto"/>
+                <w:sz w:val="22"/>
+                <w:szCs w:val="22"/>
+              </w:rPr>
+              <w:instrText xml:space="preserve"> MERGEFIELD  AdjustedPrice  \* MERGEFORMAT </w:instrText>
+            </w:r>
+            <w:r>
+              <w:rPr>
+                <w:rFonts w:eastAsia="Times New Roman" w:cs="Times New Roman"/>
+                <w:color w:val="auto"/>
+                <w:sz w:val="22"/>
+                <w:szCs w:val="22"/>
+              </w:rPr>
               <w:fldChar w:fldCharType="separate"/>
             </w:r>
             <w:r>
               <w:rPr>
+                <w:rFonts w:eastAsia="Times New Roman" w:cs="Times New Roman"/>
                 <w:noProof/>
-              </w:rPr>
-              <w:t>«RowNumber».</w:t>
-            </w:r>
-            <w:r>
-              <w:rPr>
-                <w:noProof/>
+                <w:color w:val="auto"/>
+                <w:sz w:val="22"/>
+                <w:szCs w:val="22"/>
+              </w:rPr>
+              <w:t>«AdjustedPrice»</w:t>
+            </w:r>
+            <w:r>
+              <w:rPr>
+                <w:rFonts w:eastAsia="Times New Roman" w:cs="Times New Roman"/>
+                <w:color w:val="auto"/>
+                <w:sz w:val="22"/>
+                <w:szCs w:val="22"/>
               </w:rPr>
               <w:fldChar w:fldCharType="end"/>
             </w:r>
@@ -3562,16 +3890,17 @@
         </w:tc>
         <w:tc>
           <w:tcPr>
-            <w:tcW w:w="2725" w:type="pct"/>
+            <w:tcW w:w="673" w:type="pct"/>
+            <w:vAlign w:val="center"/>
           </w:tcPr>
           <w:p>
             <w:pPr>
               <w:spacing w:before="0" w:after="200" w:line="276" w:lineRule="auto"/>
               <w:ind w:left="0" w:right="0"/>
               <w:contextualSpacing/>
-              <w:rPr>
-                <w:rFonts w:eastAsia="Times New Roman" w:cs="Times New Roman"/>
-                <w:b/>
+              <w:jc w:val="right"/>
+              <w:rPr>
+                <w:rFonts w:eastAsia="Times New Roman" w:cs="Times New Roman"/>
                 <w:color w:val="auto"/>
                 <w:sz w:val="22"/>
                 <w:szCs w:val="22"/>
@@ -3580,7 +3909,6 @@
             <w:r>
               <w:rPr>
                 <w:rFonts w:eastAsia="Times New Roman" w:cs="Times New Roman"/>
-                <w:b/>
                 <w:color w:val="auto"/>
                 <w:sz w:val="22"/>
                 <w:szCs w:val="22"/>
@@ -3590,17 +3918,15 @@
             <w:r>
               <w:rPr>
                 <w:rFonts w:eastAsia="Times New Roman" w:cs="Times New Roman"/>
-                <w:b/>
-                <w:color w:val="auto"/>
-                <w:sz w:val="22"/>
-                <w:szCs w:val="22"/>
-              </w:rPr>
-              <w:instrText xml:space="preserve"> MERGEFIELD  WebinarTitle  \* MERGEFORMAT </w:instrText>
-            </w:r>
-            <w:r>
-              <w:rPr>
-                <w:rFonts w:eastAsia="Times New Roman" w:cs="Times New Roman"/>
-                <w:b/>
+                <w:color w:val="auto"/>
+                <w:sz w:val="22"/>
+                <w:szCs w:val="22"/>
+              </w:rPr>
+              <w:instrText xml:space="preserve"> MERGEFIELD  AdjustedRoyalty  \* MERGEFORMAT </w:instrText>
+            </w:r>
+            <w:r>
+              <w:rPr>
+                <w:rFonts w:eastAsia="Times New Roman" w:cs="Times New Roman"/>
                 <w:color w:val="auto"/>
                 <w:sz w:val="22"/>
                 <w:szCs w:val="22"/>
@@ -3610,214 +3936,12 @@
             <w:r>
               <w:rPr>
                 <w:rFonts w:eastAsia="Times New Roman" w:cs="Times New Roman"/>
-                <w:b/>
                 <w:noProof/>
                 <w:color w:val="auto"/>
                 <w:sz w:val="22"/>
                 <w:szCs w:val="22"/>
               </w:rPr>
-              <w:t>«WebinarTitle»</w:t>
-            </w:r>
-            <w:r>
-              <w:rPr>
-                <w:rFonts w:eastAsia="Times New Roman" w:cs="Times New Roman"/>
-                <w:b/>
-                <w:color w:val="auto"/>
-                <w:sz w:val="22"/>
-                <w:szCs w:val="22"/>
-              </w:rPr>
-              <w:fldChar w:fldCharType="end"/>
-            </w:r>
-          </w:p>
-          <w:p>
-            <w:pPr>
-              <w:spacing w:before="0" w:after="200" w:line="276" w:lineRule="auto"/>
-              <w:ind w:left="0" w:right="0"/>
-              <w:contextualSpacing/>
-              <w:rPr>
-                <w:rFonts w:eastAsia="Times New Roman" w:cs="Times New Roman"/>
-                <w:color w:val="auto"/>
-                <w:sz w:val="22"/>
-                <w:szCs w:val="22"/>
-              </w:rPr>
-            </w:pPr>
-            <w:r>
-              <w:rPr>
-                <w:rFonts w:eastAsia="Times New Roman" w:cs="Times New Roman"/>
-                <w:color w:val="auto"/>
-                <w:sz w:val="22"/>
-                <w:szCs w:val="22"/>
-              </w:rPr>
-              <w:fldChar w:fldCharType="begin"/>
-            </w:r>
-            <w:r>
-              <w:rPr>
-                <w:rFonts w:eastAsia="Times New Roman" w:cs="Times New Roman"/>
-                <w:color w:val="auto"/>
-                <w:sz w:val="22"/>
-                <w:szCs w:val="22"/>
-              </w:rPr>
-              <w:instrText xml:space="preserve"> MERGEFIELD  Name  \* MERGEFORMAT </w:instrText>
-            </w:r>
-            <w:r>
-              <w:rPr>
-                <w:rFonts w:eastAsia="Times New Roman" w:cs="Times New Roman"/>
-                <w:color w:val="auto"/>
-                <w:sz w:val="22"/>
-                <w:szCs w:val="22"/>
-              </w:rPr>
-              <w:fldChar w:fldCharType="separate"/>
-            </w:r>
-            <w:r>
-              <w:rPr>
-                <w:rFonts w:eastAsia="Times New Roman" w:cs="Times New Roman"/>
-                <w:noProof/>
-                <w:color w:val="auto"/>
-                <w:sz w:val="22"/>
-                <w:szCs w:val="22"/>
-              </w:rPr>
-              <w:t>«Name»</w:t>
-            </w:r>
-            <w:r>
-              <w:rPr>
-                <w:rFonts w:eastAsia="Times New Roman" w:cs="Times New Roman"/>
-                <w:color w:val="auto"/>
-                <w:sz w:val="22"/>
-                <w:szCs w:val="22"/>
-              </w:rPr>
-              <w:fldChar w:fldCharType="end"/>
-            </w:r>
-            <w:r>
-              <w:rPr>
-                <w:rFonts w:eastAsia="Times New Roman" w:cs="Times New Roman"/>
-                <w:color w:val="auto"/>
-                <w:sz w:val="22"/>
-                <w:szCs w:val="22"/>
-              </w:rPr>
-              <w:t xml:space="preserve"> - </w:t>
-            </w:r>
-            <w:r>
-              <w:rPr>
-                <w:rFonts w:eastAsia="Times New Roman" w:cs="Times New Roman"/>
-                <w:color w:val="auto"/>
-                <w:sz w:val="22"/>
-                <w:szCs w:val="22"/>
-              </w:rPr>
-              <w:fldChar w:fldCharType="begin"/>
-            </w:r>
-            <w:r>
-              <w:rPr>
-                <w:rFonts w:eastAsia="Times New Roman" w:cs="Times New Roman"/>
-                <w:color w:val="auto"/>
-                <w:sz w:val="22"/>
-                <w:szCs w:val="22"/>
-              </w:rPr>
-              <w:instrText xml:space="preserve"> MERGEFIELD  Email  \* MERGEFORMAT </w:instrText>
-            </w:r>
-            <w:r>
-              <w:rPr>
-                <w:rFonts w:eastAsia="Times New Roman" w:cs="Times New Roman"/>
-                <w:color w:val="auto"/>
-                <w:sz w:val="22"/>
-                <w:szCs w:val="22"/>
-              </w:rPr>
-              <w:fldChar w:fldCharType="separate"/>
-            </w:r>
-            <w:r>
-              <w:rPr>
-                <w:rFonts w:eastAsia="Times New Roman" w:cs="Times New Roman"/>
-                <w:noProof/>
-                <w:color w:val="auto"/>
-                <w:sz w:val="22"/>
-                <w:szCs w:val="22"/>
-              </w:rPr>
-              <w:t>«Email»</w:t>
-            </w:r>
-            <w:r>
-              <w:rPr>
-                <w:rFonts w:eastAsia="Times New Roman" w:cs="Times New Roman"/>
-                <w:color w:val="auto"/>
-                <w:sz w:val="22"/>
-                <w:szCs w:val="22"/>
-              </w:rPr>
-              <w:fldChar w:fldCharType="end"/>
-            </w:r>
-            <w:r>
-              <w:rPr>
-                <w:rFonts w:eastAsia="Times New Roman" w:cs="Times New Roman"/>
-                <w:color w:val="auto"/>
-                <w:sz w:val="22"/>
-                <w:szCs w:val="22"/>
-              </w:rPr>
-              <w:fldChar w:fldCharType="begin"/>
-            </w:r>
-            <w:r>
-              <w:rPr>
-                <w:rFonts w:eastAsia="Times New Roman" w:cs="Times New Roman"/>
-                <w:color w:val="auto"/>
-                <w:sz w:val="22"/>
-                <w:szCs w:val="22"/>
-              </w:rPr>
-              <w:instrText xml:space="preserve"> MERGEFIELD  Institution  \* MERGEFORMAT </w:instrText>
-            </w:r>
-            <w:r>
-              <w:rPr>
-                <w:rFonts w:eastAsia="Times New Roman" w:cs="Times New Roman"/>
-                <w:color w:val="auto"/>
-                <w:sz w:val="22"/>
-                <w:szCs w:val="22"/>
-              </w:rPr>
-              <w:fldChar w:fldCharType="end"/>
-            </w:r>
-          </w:p>
-          <w:p>
-            <w:pPr>
-              <w:spacing w:before="0" w:after="200" w:line="276" w:lineRule="auto"/>
-              <w:ind w:left="0" w:right="0"/>
-              <w:contextualSpacing/>
-              <w:rPr>
-                <w:rFonts w:eastAsia="Times New Roman" w:cs="Times New Roman"/>
-                <w:color w:val="auto"/>
-                <w:sz w:val="22"/>
-                <w:szCs w:val="22"/>
-              </w:rPr>
-            </w:pPr>
-            <w:r>
-              <w:rPr>
-                <w:rFonts w:eastAsia="Times New Roman" w:cs="Times New Roman"/>
-                <w:color w:val="auto"/>
-                <w:sz w:val="22"/>
-                <w:szCs w:val="22"/>
-              </w:rPr>
-              <w:fldChar w:fldCharType="begin"/>
-            </w:r>
-            <w:r>
-              <w:rPr>
-                <w:rFonts w:eastAsia="Times New Roman" w:cs="Times New Roman"/>
-                <w:color w:val="auto"/>
-                <w:sz w:val="22"/>
-                <w:szCs w:val="22"/>
-              </w:rPr>
-              <w:instrText xml:space="preserve"> MERGEFIELD  Address  \* MERGEFORMAT </w:instrText>
-            </w:r>
-            <w:r>
-              <w:rPr>
-                <w:rFonts w:eastAsia="Times New Roman" w:cs="Times New Roman"/>
-                <w:color w:val="auto"/>
-                <w:sz w:val="22"/>
-                <w:szCs w:val="22"/>
-              </w:rPr>
-              <w:fldChar w:fldCharType="separate"/>
-            </w:r>
-            <w:r>
-              <w:rPr>
-                <w:rFonts w:eastAsia="Times New Roman" w:cs="Times New Roman"/>
-                <w:noProof/>
-                <w:color w:val="auto"/>
-                <w:sz w:val="22"/>
-                <w:szCs w:val="22"/>
-              </w:rPr>
-              <w:t>«Address»</w:t>
+              <w:t>«AdjustedRoyalty»</w:t>
             </w:r>
             <w:r>
               <w:rPr>
@@ -3832,7 +3956,7 @@
         </w:tc>
         <w:tc>
           <w:tcPr>
-            <w:tcW w:w="473" w:type="pct"/>
+            <w:tcW w:w="1346" w:type="pct"/>
             <w:vAlign w:val="center"/>
           </w:tcPr>
           <w:p>
@@ -3864,7 +3988,7 @@
                 <w:sz w:val="22"/>
                 <w:szCs w:val="22"/>
               </w:rPr>
-              <w:instrText xml:space="preserve"> MERGEFIELD  Price  \* MERGEFORMAT </w:instrText>
+              <w:instrText xml:space="preserve"> MERGEFIELD  Message  \* MERGEFORMAT </w:instrText>
             </w:r>
             <w:r>
               <w:rPr>
@@ -3883,265 +4007,7 @@
                 <w:sz w:val="22"/>
                 <w:szCs w:val="22"/>
               </w:rPr>
-              <w:t>«Price»</w:t>
-            </w:r>
-            <w:r>
-              <w:rPr>
-                <w:rFonts w:eastAsia="Times New Roman" w:cs="Times New Roman"/>
-                <w:color w:val="auto"/>
-                <w:sz w:val="22"/>
-                <w:szCs w:val="22"/>
-              </w:rPr>
-              <w:fldChar w:fldCharType="end"/>
-            </w:r>
-          </w:p>
-          <w:p>
-            <w:pPr>
-              <w:spacing w:before="0" w:after="200" w:line="276" w:lineRule="auto"/>
-              <w:ind w:left="0" w:right="0"/>
-              <w:contextualSpacing/>
-              <w:jc w:val="center"/>
-              <w:rPr>
-                <w:rFonts w:eastAsia="Times New Roman" w:cs="Times New Roman"/>
-                <w:color w:val="auto"/>
-                <w:sz w:val="22"/>
-                <w:szCs w:val="22"/>
-              </w:rPr>
-            </w:pPr>
-            <w:r>
-              <w:rPr>
-                <w:rFonts w:eastAsia="Times New Roman" w:cs="Times New Roman"/>
-                <w:color w:val="auto"/>
-                <w:sz w:val="22"/>
-                <w:szCs w:val="22"/>
-              </w:rPr>
-              <w:fldChar w:fldCharType="begin"/>
-            </w:r>
-            <w:r>
-              <w:rPr>
-                <w:rFonts w:eastAsia="Times New Roman" w:cs="Times New Roman"/>
-                <w:color w:val="auto"/>
-                <w:sz w:val="22"/>
-                <w:szCs w:val="22"/>
-              </w:rPr>
-              <w:instrText xml:space="preserve"> MERGEFIELD  Status  \* MERGEFORMAT </w:instrText>
-            </w:r>
-            <w:r>
-              <w:rPr>
-                <w:rFonts w:eastAsia="Times New Roman" w:cs="Times New Roman"/>
-                <w:color w:val="auto"/>
-                <w:sz w:val="22"/>
-                <w:szCs w:val="22"/>
-              </w:rPr>
-              <w:fldChar w:fldCharType="separate"/>
-            </w:r>
-            <w:r>
-              <w:rPr>
-                <w:rFonts w:eastAsia="Times New Roman" w:cs="Times New Roman"/>
-                <w:noProof/>
-                <w:color w:val="auto"/>
-                <w:sz w:val="22"/>
-                <w:szCs w:val="22"/>
-              </w:rPr>
-              <w:t>«Status»</w:t>
-            </w:r>
-            <w:r>
-              <w:rPr>
-                <w:rFonts w:eastAsia="Times New Roman" w:cs="Times New Roman"/>
-                <w:color w:val="auto"/>
-                <w:sz w:val="22"/>
-                <w:szCs w:val="22"/>
-              </w:rPr>
-              <w:fldChar w:fldCharType="end"/>
-            </w:r>
-          </w:p>
-        </w:tc>
-        <w:tc>
-          <w:tcPr>
-            <w:tcW w:w="473" w:type="pct"/>
-            <w:vAlign w:val="center"/>
-          </w:tcPr>
-          <w:p>
-            <w:pPr>
-              <w:spacing w:before="0" w:after="200" w:line="276" w:lineRule="auto"/>
-              <w:ind w:left="0" w:right="0"/>
-              <w:contextualSpacing/>
-              <w:jc w:val="right"/>
-              <w:rPr>
-                <w:rFonts w:eastAsia="Times New Roman" w:cs="Times New Roman"/>
-                <w:color w:val="auto"/>
-                <w:sz w:val="22"/>
-                <w:szCs w:val="22"/>
-              </w:rPr>
-            </w:pPr>
-            <w:r>
-              <w:rPr>
-                <w:rFonts w:eastAsia="Times New Roman" w:cs="Times New Roman"/>
-                <w:color w:val="auto"/>
-                <w:sz w:val="22"/>
-                <w:szCs w:val="22"/>
-              </w:rPr>
-              <w:fldChar w:fldCharType="begin"/>
-            </w:r>
-            <w:r>
-              <w:rPr>
-                <w:rFonts w:eastAsia="Times New Roman" w:cs="Times New Roman"/>
-                <w:color w:val="auto"/>
-                <w:sz w:val="22"/>
-                <w:szCs w:val="22"/>
-              </w:rPr>
-              <w:instrText xml:space="preserve"> MERGEFIELD  Percent  \* MERGEFORMAT </w:instrText>
-            </w:r>
-            <w:r>
-              <w:rPr>
-                <w:rFonts w:eastAsia="Times New Roman" w:cs="Times New Roman"/>
-                <w:color w:val="auto"/>
-                <w:sz w:val="22"/>
-                <w:szCs w:val="22"/>
-              </w:rPr>
-              <w:fldChar w:fldCharType="separate"/>
-            </w:r>
-            <w:r>
-              <w:rPr>
-                <w:rFonts w:eastAsia="Times New Roman" w:cs="Times New Roman"/>
-                <w:noProof/>
-                <w:color w:val="auto"/>
-                <w:sz w:val="22"/>
-                <w:szCs w:val="22"/>
-              </w:rPr>
-              <w:t>«Percent»</w:t>
-            </w:r>
-            <w:r>
-              <w:rPr>
-                <w:rFonts w:eastAsia="Times New Roman" w:cs="Times New Roman"/>
-                <w:color w:val="auto"/>
-                <w:sz w:val="22"/>
-                <w:szCs w:val="22"/>
-              </w:rPr>
-              <w:fldChar w:fldCharType="end"/>
-            </w:r>
-          </w:p>
-        </w:tc>
-        <w:tc>
-          <w:tcPr>
-            <w:tcW w:w="473" w:type="pct"/>
-            <w:vAlign w:val="center"/>
-          </w:tcPr>
-          <w:p>
-            <w:pPr>
-              <w:spacing w:before="0" w:after="200" w:line="276" w:lineRule="auto"/>
-              <w:ind w:left="0" w:right="0"/>
-              <w:contextualSpacing/>
-              <w:jc w:val="right"/>
-              <w:rPr>
-                <w:rFonts w:eastAsia="Times New Roman" w:cs="Times New Roman"/>
-                <w:color w:val="auto"/>
-                <w:sz w:val="22"/>
-                <w:szCs w:val="22"/>
-              </w:rPr>
-            </w:pPr>
-            <w:r>
-              <w:rPr>
-                <w:rFonts w:eastAsia="Times New Roman" w:cs="Times New Roman"/>
-                <w:color w:val="auto"/>
-                <w:sz w:val="22"/>
-                <w:szCs w:val="22"/>
-              </w:rPr>
-              <w:fldChar w:fldCharType="begin"/>
-            </w:r>
-            <w:r>
-              <w:rPr>
-                <w:rFonts w:eastAsia="Times New Roman" w:cs="Times New Roman"/>
-                <w:color w:val="auto"/>
-                <w:sz w:val="22"/>
-                <w:szCs w:val="22"/>
-              </w:rPr>
-              <w:instrText xml:space="preserve"> MERGEFIELD  Royalty  \* MERGEFORMAT </w:instrText>
-            </w:r>
-            <w:r>
-              <w:rPr>
-                <w:rFonts w:eastAsia="Times New Roman" w:cs="Times New Roman"/>
-                <w:color w:val="auto"/>
-                <w:sz w:val="22"/>
-                <w:szCs w:val="22"/>
-              </w:rPr>
-              <w:fldChar w:fldCharType="separate"/>
-            </w:r>
-            <w:r>
-              <w:rPr>
-                <w:rFonts w:eastAsia="Times New Roman" w:cs="Times New Roman"/>
-                <w:noProof/>
-                <w:color w:val="auto"/>
-                <w:sz w:val="22"/>
-                <w:szCs w:val="22"/>
-              </w:rPr>
-              <w:t>«Royalty»</w:t>
-            </w:r>
-            <w:r>
-              <w:rPr>
-                <w:rFonts w:eastAsia="Times New Roman" w:cs="Times New Roman"/>
-                <w:color w:val="auto"/>
-                <w:sz w:val="22"/>
-                <w:szCs w:val="22"/>
-              </w:rPr>
-              <w:fldChar w:fldCharType="end"/>
-            </w:r>
-          </w:p>
-        </w:tc>
-        <w:tc>
-          <w:tcPr>
-            <w:tcW w:w="608" w:type="pct"/>
-            <w:vAlign w:val="center"/>
-          </w:tcPr>
-          <w:p>
-            <w:pPr>
-              <w:spacing w:before="0" w:after="200" w:line="276" w:lineRule="auto"/>
-              <w:ind w:left="0" w:right="0"/>
-              <w:contextualSpacing/>
-              <w:jc w:val="center"/>
-              <w:rPr>
-                <w:rFonts w:eastAsia="Times New Roman" w:cs="Times New Roman"/>
-                <w:color w:val="auto"/>
-                <w:sz w:val="22"/>
-                <w:szCs w:val="22"/>
-              </w:rPr>
-            </w:pPr>
-            <w:r>
-              <w:rPr>
-                <w:rFonts w:eastAsia="Times New Roman" w:cs="Times New Roman"/>
-                <w:color w:val="auto"/>
-                <w:sz w:val="22"/>
-                <w:szCs w:val="22"/>
-              </w:rPr>
-              <w:fldChar w:fldCharType="begin"/>
-            </w:r>
-            <w:r>
-              <w:rPr>
-                <w:rFonts w:eastAsia="Times New Roman" w:cs="Times New Roman"/>
-                <w:color w:val="auto"/>
-                <w:sz w:val="22"/>
-                <w:szCs w:val="22"/>
-              </w:rPr>
-              <w:instrText xml:space="preserve"> MERGEFIELD  OrderID  \* MERGEFORMAT </w:instrText>
-            </w:r>
-            <w:r>
-              <w:rPr>
-                <w:rFonts w:eastAsia="Times New Roman" w:cs="Times New Roman"/>
-                <w:color w:val="auto"/>
-                <w:sz w:val="22"/>
-                <w:szCs w:val="22"/>
-              </w:rPr>
-              <w:fldChar w:fldCharType="separate"/>
-            </w:r>
-            <w:r>
-              <w:rPr>
-                <w:rFonts w:eastAsia="Times New Roman" w:cs="Times New Roman"/>
-                <w:noProof/>
-                <w:color w:val="auto"/>
-                <w:sz w:val="22"/>
-                <w:szCs w:val="22"/>
-              </w:rPr>
-              <w:t>«OrderID»</w:t>
+              <w:t>«Message»</w:t>
             </w:r>
             <w:r>
               <w:rPr>
@@ -4240,13 +4106,14 @@
         <w:rPr>
           <w:color w:val="auto"/>
         </w:rPr>
+        <w:lastRenderedPageBreak/>
         <w:fldChar w:fldCharType="begin"/>
       </w:r>
       <w:r>
         <w:rPr>
           <w:color w:val="auto"/>
         </w:rPr>
-        <w:instrText xml:space="preserve"> MERGEFIELD  TotalRevenueBilledLabel  \* MERGEFORMAT </w:instrText>
+        <w:instrText xml:space="preserve"> MERGEFIELD  TotalAdjustedBilledLabel  \* MERGEFORMAT </w:instrText>
       </w:r>
       <w:r>
         <w:rPr>
@@ -4259,7 +4126,7 @@
           <w:noProof/>
           <w:color w:val="auto"/>
         </w:rPr>
-        <w:t>«TotalRevenueBilledLabel»</w:t>
+        <w:t>«TotalAdjustedBilledLabel»</w:t>
       </w:r>
       <w:r>
         <w:rPr>
@@ -4313,14 +4180,13 @@
         <w:rPr>
           <w:color w:val="auto"/>
         </w:rPr>
-        <w:lastRenderedPageBreak/>
         <w:fldChar w:fldCharType="begin"/>
       </w:r>
       <w:r>
         <w:rPr>
           <w:color w:val="auto"/>
         </w:rPr>
-        <w:instrText xml:space="preserve"> MERGEFIELD  TotalRevenuePaidLabel  \* MERGEFORMAT </w:instrText>
+        <w:instrText xml:space="preserve"> MERGEFIELD  TotalAdjustedPaidLabel  \* MERGEFORMAT </w:instrText>
       </w:r>
       <w:r>
         <w:rPr>
@@ -4333,7 +4199,7 @@
           <w:noProof/>
           <w:color w:val="auto"/>
         </w:rPr>
-        <w:t>«TotalRevenuePaidLabel»</w:t>
+        <w:t>«TotalAdjustedPaidLabel»</w:t>
       </w:r>
       <w:r>
         <w:rPr>
@@ -4393,7 +4259,7 @@
         <w:rPr>
           <w:color w:val="auto"/>
         </w:rPr>
-        <w:instrText xml:space="preserve"> MERGEFIELD  TotalRoyaltiesLabel  \* MERGEFORMAT </w:instrText>
+        <w:instrText xml:space="preserve"> MERGEFIELD  TotalAdjustedRoyaltiesLabel  \* MERGEFORMAT </w:instrText>
       </w:r>
       <w:r>
         <w:rPr>
@@ -4406,7 +4272,7 @@
           <w:noProof/>
           <w:color w:val="auto"/>
         </w:rPr>
-        <w:t>«TotalRoyaltiesLabel»</w:t>
+        <w:t>«TotalAdjustedRoyaltiesLabel»</w:t>
       </w:r>
       <w:r>
         <w:rPr>
@@ -4472,7 +4338,7 @@
           <w:sz w:val="22"/>
           <w:szCs w:val="22"/>
         </w:rPr>
-        <w:instrText xml:space="preserve"> MERGEFIELD  TotalNetDueLabel  \* MERGEFORMAT </w:instrText>
+        <w:instrText xml:space="preserve"> MERGEFIELD  TotalAdjustedNetDueLabel  \* MERGEFORMAT </w:instrText>
       </w:r>
       <w:r>
         <w:rPr>
@@ -4491,7 +4357,7 @@
           <w:sz w:val="22"/>
           <w:szCs w:val="22"/>
         </w:rPr>
-        <w:t>«TotalNetDueLabel»</w:t>
+        <w:t>«TotalAdjustedNetDueLabel»</w:t>
       </w:r>
       <w:r>
         <w:rPr>
@@ -4608,9 +4474,9 @@
         </w:rPr>
       </w:pPr>
     </w:p>
+    <w:bookmarkEnd w:id="0"/>
     <w:bookmarkEnd w:id="1"/>
     <w:bookmarkEnd w:id="2"/>
-    <w:bookmarkEnd w:id="3"/>
     <w:p>
       <w:pPr>
         <w:tabs>
@@ -4839,15 +4705,16 @@
           <w:szCs w:val="22"/>
         </w:rPr>
       </w:pPr>
-      <w:r>
-        <w:rPr>
-          <w:rFonts w:eastAsia="Times New Roman" w:cs="Times New Roman"/>
-          <w:color w:val="auto"/>
-          <w:sz w:val="22"/>
-          <w:szCs w:val="22"/>
-        </w:rPr>
-        <w:t xml:space="preserve">Grand Total Revenue Billed: </w:t>
-      </w:r>
+      <w:fldSimple w:instr=" MERGEFIELD  GrandTotalRevenueBilledLabel  \* MERGEFORMAT ">
+        <w:r>
+          <w:rPr>
+            <w:noProof/>
+          </w:rPr>
+          <w:t>«GrandTotalRevenueBilledLabel»</w:t>
+        </w:r>
+      </w:fldSimple>
+      <w:bookmarkStart w:id="3" w:name="_GoBack"/>
+      <w:bookmarkEnd w:id="3"/>
       <w:r>
         <w:fldChar w:fldCharType="begin"/>
       </w:r>
@@ -4876,39 +4743,22 @@
         <w:ind w:left="0" w:right="0" w:firstLine="720"/>
         <w:contextualSpacing/>
       </w:pPr>
-      <w:r>
-        <w:rPr>
-          <w:rFonts w:eastAsia="Times New Roman" w:cs="Times New Roman"/>
-          <w:color w:val="auto"/>
-          <w:sz w:val="22"/>
-          <w:szCs w:val="22"/>
-        </w:rPr>
-        <w:t>Grand Total Revenue Paid:</w:t>
-      </w:r>
-      <w:r>
-        <w:t xml:space="preserve"> </w:t>
-      </w:r>
-      <w:r>
-        <w:fldChar w:fldCharType="begin"/>
-      </w:r>
-      <w:r>
-        <w:instrText xml:space="preserve"> MERGEFIELD  GrandTotalOnPaid  \* MERGEFORMAT </w:instrText>
-      </w:r>
-      <w:r>
-        <w:fldChar w:fldCharType="separate"/>
-      </w:r>
-      <w:r>
-        <w:rPr>
-          <w:noProof/>
-        </w:rPr>
-        <w:t>«GrandTotalOnPaid»</w:t>
-      </w:r>
-      <w:r>
-        <w:rPr>
-          <w:noProof/>
-        </w:rPr>
-        <w:fldChar w:fldCharType="end"/>
-      </w:r>
+      <w:fldSimple w:instr=" MERGEFIELD  GrandTotalRevenuePaidLabel  \* MERGEFORMAT ">
+        <w:r>
+          <w:rPr>
+            <w:noProof/>
+          </w:rPr>
+          <w:t>«GrandTotalRevenuePaidLabel»</w:t>
+        </w:r>
+      </w:fldSimple>
+      <w:fldSimple w:instr=" MERGEFIELD  GrandTotalOnPaid  \* MERGEFORMAT ">
+        <w:r>
+          <w:rPr>
+            <w:noProof/>
+          </w:rPr>
+          <w:t>«GrandTotalOnPaid»</w:t>
+        </w:r>
+      </w:fldSimple>
     </w:p>
     <w:p>
       <w:pPr>
@@ -4916,18 +4766,14 @@
         <w:ind w:left="0" w:right="0" w:firstLine="720"/>
         <w:contextualSpacing/>
       </w:pPr>
-      <w:r>
-        <w:rPr>
-          <w:rFonts w:eastAsia="Times New Roman" w:cs="Times New Roman"/>
-          <w:color w:val="auto"/>
-          <w:sz w:val="22"/>
-          <w:szCs w:val="22"/>
-        </w:rPr>
-        <w:t>Grand Total Royalties:</w:t>
-      </w:r>
-      <w:r>
-        <w:t xml:space="preserve"> </w:t>
-      </w:r>
+      <w:fldSimple w:instr=" MERGEFIELD  GrandTotalRoyalties  \* MERGEFORMAT ">
+        <w:r>
+          <w:rPr>
+            <w:noProof/>
+          </w:rPr>
+          <w:t>«GrandTotalRoyalties»</w:t>
+        </w:r>
+      </w:fldSimple>
       <w:r>
         <w:fldChar w:fldCharType="begin"/>
       </w:r>

</xml_diff>